<commit_message>
P10: async, await, dan satu try/catch
</commit_message>
<xml_diff>
--- a/worksheet-p10/25523236-Diah Putri Pertiwi.docx
+++ b/worksheet-p10/25523236-Diah Putri Pertiwi.docx
@@ -109,7 +109,51 @@
           <w:sz w:val="18"/>
           <w:szCs w:val="18"/>
         </w:rPr>
-        <w:t xml:space="preserve"> Web  ·  SIF302  ·  Semester </w:t>
+        <w:t xml:space="preserve"> </w:t>
+      </w:r>
+      <w:proofErr w:type="gramStart"/>
+      <w:r>
+        <w:rPr>
+          <w:i/>
+          <w:iCs/>
+          <w:color w:val="5A6080"/>
+          <w:sz w:val="18"/>
+          <w:szCs w:val="18"/>
+        </w:rPr>
+        <w:t>Web  ·</w:t>
+      </w:r>
+      <w:proofErr w:type="gramEnd"/>
+      <w:r>
+        <w:rPr>
+          <w:i/>
+          <w:iCs/>
+          <w:color w:val="5A6080"/>
+          <w:sz w:val="18"/>
+          <w:szCs w:val="18"/>
+        </w:rPr>
+        <w:t xml:space="preserve">  SIF</w:t>
+      </w:r>
+      <w:proofErr w:type="gramStart"/>
+      <w:r>
+        <w:rPr>
+          <w:i/>
+          <w:iCs/>
+          <w:color w:val="5A6080"/>
+          <w:sz w:val="18"/>
+          <w:szCs w:val="18"/>
+        </w:rPr>
+        <w:t>302  ·</w:t>
+      </w:r>
+      <w:proofErr w:type="gramEnd"/>
+      <w:r>
+        <w:rPr>
+          <w:i/>
+          <w:iCs/>
+          <w:color w:val="5A6080"/>
+          <w:sz w:val="18"/>
+          <w:szCs w:val="18"/>
+        </w:rPr>
+        <w:t xml:space="preserve">  Semester </w:t>
       </w:r>
       <w:proofErr w:type="spellStart"/>
       <w:r>
@@ -377,7 +421,29 @@
                 <w:sz w:val="17"/>
                 <w:szCs w:val="17"/>
               </w:rPr>
-              <w:t xml:space="preserve"> 10  ·  JavaScript </w:t>
+              <w:t xml:space="preserve"> </w:t>
+            </w:r>
+            <w:proofErr w:type="gramStart"/>
+            <w:r>
+              <w:rPr>
+                <w:b/>
+                <w:bCs/>
+                <w:color w:val="003796"/>
+                <w:sz w:val="17"/>
+                <w:szCs w:val="17"/>
+              </w:rPr>
+              <w:t>10  ·</w:t>
+            </w:r>
+            <w:proofErr w:type="gramEnd"/>
+            <w:r>
+              <w:rPr>
+                <w:b/>
+                <w:bCs/>
+                <w:color w:val="003796"/>
+                <w:sz w:val="17"/>
+                <w:szCs w:val="17"/>
+              </w:rPr>
+              <w:t xml:space="preserve">  JavaScript </w:t>
             </w:r>
             <w:proofErr w:type="spellStart"/>
             <w:r>
@@ -443,6 +509,7 @@
             <w:pPr>
               <w:spacing w:after="0"/>
             </w:pPr>
+            <w:proofErr w:type="gramStart"/>
             <w:r>
               <w:rPr>
                 <w:b/>
@@ -463,6 +530,7 @@
               <w:t>Dikerjakan</w:t>
             </w:r>
             <w:proofErr w:type="spellEnd"/>
+            <w:proofErr w:type="gramEnd"/>
             <w:r>
               <w:rPr>
                 <w:color w:val="1A1A2E"/>
@@ -1647,6 +1715,7 @@
               <w:t xml:space="preserve">2. </w:t>
             </w:r>
             <w:proofErr w:type="spellStart"/>
+            <w:proofErr w:type="gramStart"/>
             <w:r>
               <w:rPr>
                 <w:color w:val="1A1A2E"/>
@@ -1656,6 +1725,7 @@
               <w:t>respons.ok</w:t>
             </w:r>
             <w:proofErr w:type="spellEnd"/>
+            <w:proofErr w:type="gramEnd"/>
             <w:r>
               <w:rPr>
                 <w:color w:val="1A1A2E"/>
@@ -3718,6 +3788,7 @@
               <w:t xml:space="preserve"> </w:t>
             </w:r>
             <w:proofErr w:type="spellStart"/>
+            <w:proofErr w:type="gramStart"/>
             <w:r>
               <w:rPr>
                 <w:color w:val="1A1A2E"/>
@@ -3727,6 +3798,7 @@
               <w:t>notisia.json</w:t>
             </w:r>
             <w:proofErr w:type="spellEnd"/>
+            <w:proofErr w:type="gramEnd"/>
             <w:r>
               <w:rPr>
                 <w:color w:val="1A1A2E"/>
@@ -4795,6 +4867,7 @@
               <w:t xml:space="preserve"> </w:t>
             </w:r>
             <w:proofErr w:type="spellStart"/>
+            <w:proofErr w:type="gramStart"/>
             <w:r>
               <w:rPr>
                 <w:color w:val="1A1A2E"/>
@@ -4804,6 +4877,7 @@
               <w:t>respons.ok</w:t>
             </w:r>
             <w:proofErr w:type="spellEnd"/>
+            <w:proofErr w:type="gramEnd"/>
           </w:p>
         </w:tc>
         <w:tc>
@@ -5189,6 +5263,7 @@
               <w:t xml:space="preserve"> </w:t>
             </w:r>
             <w:proofErr w:type="spellStart"/>
+            <w:proofErr w:type="gramStart"/>
             <w:r>
               <w:rPr>
                 <w:color w:val="1A1A2E"/>
@@ -5204,7 +5279,16 @@
                 <w:sz w:val="18"/>
                 <w:szCs w:val="18"/>
               </w:rPr>
-              <w:t xml:space="preserve">(), </w:t>
+              <w:t>(</w:t>
+            </w:r>
+            <w:proofErr w:type="gramEnd"/>
+            <w:r>
+              <w:rPr>
+                <w:color w:val="1A1A2E"/>
+                <w:sz w:val="18"/>
+                <w:szCs w:val="18"/>
+              </w:rPr>
+              <w:t xml:space="preserve">), </w:t>
             </w:r>
             <w:proofErr w:type="spellStart"/>
             <w:r>
@@ -6687,24 +6771,36 @@
             <w:pPr>
               <w:spacing w:after="0"/>
             </w:pPr>
+            <w:proofErr w:type="gramStart"/>
             <w:r>
               <w:rPr>
                 <w:color w:val="FFFFFF"/>
                 <w:sz w:val="17"/>
                 <w:szCs w:val="17"/>
               </w:rPr>
-              <w:t xml:space="preserve">▌  fetch TIDAK MELEMPAR GALAT PADA STATUS 404, PERIKSA </w:t>
-            </w:r>
-            <w:proofErr w:type="spellStart"/>
+              <w:t>▌  fetch</w:t>
+            </w:r>
+            <w:proofErr w:type="gramEnd"/>
             <w:r>
               <w:rPr>
                 <w:color w:val="FFFFFF"/>
                 <w:sz w:val="17"/>
                 <w:szCs w:val="17"/>
               </w:rPr>
+              <w:t xml:space="preserve"> TIDAK MELEMPAR GALAT PADA STATUS 404, PERIKSA </w:t>
+            </w:r>
+            <w:proofErr w:type="spellStart"/>
+            <w:proofErr w:type="gramStart"/>
+            <w:r>
+              <w:rPr>
+                <w:color w:val="FFFFFF"/>
+                <w:sz w:val="17"/>
+                <w:szCs w:val="17"/>
+              </w:rPr>
               <w:t>respons.ok</w:t>
             </w:r>
             <w:proofErr w:type="spellEnd"/>
+            <w:proofErr w:type="gramEnd"/>
           </w:p>
           <w:p>
             <w:pPr>
@@ -7137,6 +7233,7 @@
       <w:pPr>
         <w:spacing w:before="280" w:after="80"/>
       </w:pPr>
+      <w:proofErr w:type="gramStart"/>
       <w:r>
         <w:rPr>
           <w:b/>
@@ -7159,6 +7256,7 @@
         <w:t>Berkas</w:t>
       </w:r>
       <w:proofErr w:type="spellEnd"/>
+      <w:proofErr w:type="gramEnd"/>
       <w:r>
         <w:rPr>
           <w:b/>
@@ -8057,6 +8155,7 @@
       <w:pPr>
         <w:spacing w:before="280" w:after="80"/>
       </w:pPr>
+      <w:proofErr w:type="gramStart"/>
       <w:r>
         <w:rPr>
           <w:b/>
@@ -8079,6 +8178,7 @@
         <w:t>Tetapkan</w:t>
       </w:r>
       <w:proofErr w:type="spellEnd"/>
+      <w:proofErr w:type="gramEnd"/>
       <w:r>
         <w:rPr>
           <w:b/>
@@ -9280,6 +9380,7 @@
       <w:pPr>
         <w:spacing w:before="280" w:after="80"/>
       </w:pPr>
+      <w:proofErr w:type="gramStart"/>
       <w:r>
         <w:rPr>
           <w:b/>
@@ -9302,6 +9403,7 @@
         <w:t>Panggil</w:t>
       </w:r>
       <w:proofErr w:type="spellEnd"/>
+      <w:proofErr w:type="gramEnd"/>
       <w:r>
         <w:rPr>
           <w:b/>
@@ -9426,6 +9528,7 @@
         <w:t xml:space="preserve"> </w:t>
       </w:r>
       <w:proofErr w:type="spellStart"/>
+      <w:proofErr w:type="gramStart"/>
       <w:r>
         <w:rPr>
           <w:color w:val="1A1A2E"/>
@@ -9433,6 +9536,7 @@
         <w:t>respons.ok</w:t>
       </w:r>
       <w:proofErr w:type="spellEnd"/>
+      <w:proofErr w:type="gramEnd"/>
       <w:r>
         <w:rPr>
           <w:color w:val="1A1A2E"/>
@@ -9595,6 +9699,7 @@
               <w:t xml:space="preserve">async function </w:t>
             </w:r>
             <w:proofErr w:type="spellStart"/>
+            <w:proofErr w:type="gramStart"/>
             <w:r>
               <w:rPr>
                 <w:rFonts w:ascii="Verdana" w:eastAsia="Verdana" w:hAnsi="Verdana" w:cs="Verdana"/>
@@ -9612,13 +9717,9 @@
                 <w:sz w:val="17"/>
                 <w:szCs w:val="17"/>
               </w:rPr>
-              <w:t>() {</w:t>
-            </w:r>
-          </w:p>
-          <w:p>
-            <w:pPr>
-              <w:spacing w:after="0"/>
-            </w:pPr>
+              <w:t>(</w:t>
+            </w:r>
+            <w:proofErr w:type="gramEnd"/>
             <w:r>
               <w:rPr>
                 <w:rFonts w:ascii="Verdana" w:eastAsia="Verdana" w:hAnsi="Verdana" w:cs="Verdana"/>
@@ -9626,9 +9727,13 @@
                 <w:sz w:val="17"/>
                 <w:szCs w:val="17"/>
               </w:rPr>
-              <w:t xml:space="preserve">  const </w:t>
-            </w:r>
-            <w:proofErr w:type="spellStart"/>
+              <w:t>) {</w:t>
+            </w:r>
+          </w:p>
+          <w:p>
+            <w:pPr>
+              <w:spacing w:after="0"/>
+            </w:pPr>
             <w:r>
               <w:rPr>
                 <w:rFonts w:ascii="Verdana" w:eastAsia="Verdana" w:hAnsi="Verdana" w:cs="Verdana"/>
@@ -9636,9 +9741,9 @@
                 <w:sz w:val="17"/>
                 <w:szCs w:val="17"/>
               </w:rPr>
-              <w:t>respons</w:t>
-            </w:r>
-            <w:proofErr w:type="spellEnd"/>
+              <w:t xml:space="preserve">  const </w:t>
+            </w:r>
+            <w:proofErr w:type="spellStart"/>
             <w:r>
               <w:rPr>
                 <w:rFonts w:ascii="Verdana" w:eastAsia="Verdana" w:hAnsi="Verdana" w:cs="Verdana"/>
@@ -9646,13 +9751,9 @@
                 <w:sz w:val="17"/>
                 <w:szCs w:val="17"/>
               </w:rPr>
-              <w:t xml:space="preserve"> = await fetch(ALAMAT);</w:t>
-            </w:r>
-          </w:p>
-          <w:p>
-            <w:pPr>
-              <w:spacing w:after="0"/>
-            </w:pPr>
+              <w:t>respons</w:t>
+            </w:r>
+            <w:proofErr w:type="spellEnd"/>
             <w:r>
               <w:rPr>
                 <w:rFonts w:ascii="Verdana" w:eastAsia="Verdana" w:hAnsi="Verdana" w:cs="Verdana"/>
@@ -9660,9 +9761,9 @@
                 <w:sz w:val="17"/>
                 <w:szCs w:val="17"/>
               </w:rPr>
-              <w:t xml:space="preserve">  console.log('status', </w:t>
-            </w:r>
-            <w:proofErr w:type="spellStart"/>
+              <w:t xml:space="preserve"> = await </w:t>
+            </w:r>
+            <w:proofErr w:type="gramStart"/>
             <w:r>
               <w:rPr>
                 <w:rFonts w:ascii="Verdana" w:eastAsia="Verdana" w:hAnsi="Verdana" w:cs="Verdana"/>
@@ -9670,9 +9771,9 @@
                 <w:sz w:val="17"/>
                 <w:szCs w:val="17"/>
               </w:rPr>
-              <w:t>respons.status</w:t>
-            </w:r>
-            <w:proofErr w:type="spellEnd"/>
+              <w:t>fetch(</w:t>
+            </w:r>
+            <w:proofErr w:type="gramEnd"/>
             <w:r>
               <w:rPr>
                 <w:rFonts w:ascii="Verdana" w:eastAsia="Verdana" w:hAnsi="Verdana" w:cs="Verdana"/>
@@ -9680,9 +9781,13 @@
                 <w:sz w:val="17"/>
                 <w:szCs w:val="17"/>
               </w:rPr>
-              <w:t xml:space="preserve">, 'ok', </w:t>
-            </w:r>
-            <w:proofErr w:type="spellStart"/>
+              <w:t>ALAMAT);</w:t>
+            </w:r>
+          </w:p>
+          <w:p>
+            <w:pPr>
+              <w:spacing w:after="0"/>
+            </w:pPr>
             <w:r>
               <w:rPr>
                 <w:rFonts w:ascii="Verdana" w:eastAsia="Verdana" w:hAnsi="Verdana" w:cs="Verdana"/>
@@ -9690,9 +9795,9 @@
                 <w:sz w:val="17"/>
                 <w:szCs w:val="17"/>
               </w:rPr>
-              <w:t>respons.ok</w:t>
-            </w:r>
-            <w:proofErr w:type="spellEnd"/>
+              <w:t xml:space="preserve">  </w:t>
+            </w:r>
+            <w:proofErr w:type="gramStart"/>
             <w:r>
               <w:rPr>
                 <w:rFonts w:ascii="Verdana" w:eastAsia="Verdana" w:hAnsi="Verdana" w:cs="Verdana"/>
@@ -9700,13 +9805,9 @@
                 <w:sz w:val="17"/>
                 <w:szCs w:val="17"/>
               </w:rPr>
-              <w:t>);</w:t>
-            </w:r>
-          </w:p>
-          <w:p>
-            <w:pPr>
-              <w:spacing w:after="0"/>
-            </w:pPr>
+              <w:t>console.log(</w:t>
+            </w:r>
+            <w:proofErr w:type="gramEnd"/>
             <w:r>
               <w:rPr>
                 <w:rFonts w:ascii="Verdana" w:eastAsia="Verdana" w:hAnsi="Verdana" w:cs="Verdana"/>
@@ -9714,9 +9815,10 @@
                 <w:sz w:val="17"/>
                 <w:szCs w:val="17"/>
               </w:rPr>
-              <w:t xml:space="preserve">  if (!</w:t>
-            </w:r>
-            <w:proofErr w:type="spellStart"/>
+              <w:t xml:space="preserve">'status', </w:t>
+            </w:r>
+            <w:proofErr w:type="spellStart"/>
+            <w:proofErr w:type="gramStart"/>
             <w:r>
               <w:rPr>
                 <w:rFonts w:ascii="Verdana" w:eastAsia="Verdana" w:hAnsi="Verdana" w:cs="Verdana"/>
@@ -9724,9 +9826,10 @@
                 <w:sz w:val="17"/>
                 <w:szCs w:val="17"/>
               </w:rPr>
-              <w:t>respons.ok</w:t>
-            </w:r>
-            <w:proofErr w:type="spellEnd"/>
+              <w:t>respons.status</w:t>
+            </w:r>
+            <w:proofErr w:type="spellEnd"/>
+            <w:proofErr w:type="gramEnd"/>
             <w:r>
               <w:rPr>
                 <w:rFonts w:ascii="Verdana" w:eastAsia="Verdana" w:hAnsi="Verdana" w:cs="Verdana"/>
@@ -9734,13 +9837,10 @@
                 <w:sz w:val="17"/>
                 <w:szCs w:val="17"/>
               </w:rPr>
-              <w:t>) {</w:t>
-            </w:r>
-          </w:p>
-          <w:p>
-            <w:pPr>
-              <w:spacing w:after="0"/>
-            </w:pPr>
+              <w:t xml:space="preserve">, 'ok', </w:t>
+            </w:r>
+            <w:proofErr w:type="spellStart"/>
+            <w:proofErr w:type="gramStart"/>
             <w:r>
               <w:rPr>
                 <w:rFonts w:ascii="Verdana" w:eastAsia="Verdana" w:hAnsi="Verdana" w:cs="Verdana"/>
@@ -9748,9 +9848,10 @@
                 <w:sz w:val="17"/>
                 <w:szCs w:val="17"/>
               </w:rPr>
-              <w:t xml:space="preserve">    throw new Error('status ' + </w:t>
-            </w:r>
-            <w:proofErr w:type="spellStart"/>
+              <w:t>respons.ok</w:t>
+            </w:r>
+            <w:proofErr w:type="spellEnd"/>
+            <w:proofErr w:type="gramEnd"/>
             <w:r>
               <w:rPr>
                 <w:rFonts w:ascii="Verdana" w:eastAsia="Verdana" w:hAnsi="Verdana" w:cs="Verdana"/>
@@ -9758,9 +9859,13 @@
                 <w:sz w:val="17"/>
                 <w:szCs w:val="17"/>
               </w:rPr>
-              <w:t>respons.status</w:t>
-            </w:r>
-            <w:proofErr w:type="spellEnd"/>
+              <w:t>);</w:t>
+            </w:r>
+          </w:p>
+          <w:p>
+            <w:pPr>
+              <w:spacing w:after="0"/>
+            </w:pPr>
             <w:r>
               <w:rPr>
                 <w:rFonts w:ascii="Verdana" w:eastAsia="Verdana" w:hAnsi="Verdana" w:cs="Verdana"/>
@@ -9768,13 +9873,9 @@
                 <w:sz w:val="17"/>
                 <w:szCs w:val="17"/>
               </w:rPr>
-              <w:t>);</w:t>
-            </w:r>
-          </w:p>
-          <w:p>
-            <w:pPr>
-              <w:spacing w:after="0"/>
-            </w:pPr>
+              <w:t xml:space="preserve">  if </w:t>
+            </w:r>
+            <w:proofErr w:type="gramStart"/>
             <w:r>
               <w:rPr>
                 <w:rFonts w:ascii="Verdana" w:eastAsia="Verdana" w:hAnsi="Verdana" w:cs="Verdana"/>
@@ -9782,13 +9883,9 @@
                 <w:sz w:val="17"/>
                 <w:szCs w:val="17"/>
               </w:rPr>
-              <w:t xml:space="preserve">  }</w:t>
-            </w:r>
-          </w:p>
-          <w:p>
-            <w:pPr>
-              <w:spacing w:after="0"/>
-            </w:pPr>
+              <w:t>(!</w:t>
+            </w:r>
+            <w:proofErr w:type="spellStart"/>
             <w:r>
               <w:rPr>
                 <w:rFonts w:ascii="Verdana" w:eastAsia="Verdana" w:hAnsi="Verdana" w:cs="Verdana"/>
@@ -9796,9 +9893,9 @@
                 <w:sz w:val="17"/>
                 <w:szCs w:val="17"/>
               </w:rPr>
-              <w:t xml:space="preserve">  return </w:t>
-            </w:r>
-            <w:proofErr w:type="spellStart"/>
+              <w:t>respons</w:t>
+            </w:r>
+            <w:proofErr w:type="gramEnd"/>
             <w:r>
               <w:rPr>
                 <w:rFonts w:ascii="Verdana" w:eastAsia="Verdana" w:hAnsi="Verdana" w:cs="Verdana"/>
@@ -9806,9 +9903,126 @@
                 <w:sz w:val="17"/>
                 <w:szCs w:val="17"/>
               </w:rPr>
+              <w:t>.</w:t>
+            </w:r>
+            <w:proofErr w:type="gramStart"/>
+            <w:r>
+              <w:rPr>
+                <w:rFonts w:ascii="Verdana" w:eastAsia="Verdana" w:hAnsi="Verdana" w:cs="Verdana"/>
+                <w:color w:val="1F2A44"/>
+                <w:sz w:val="17"/>
+                <w:szCs w:val="17"/>
+              </w:rPr>
+              <w:t>ok</w:t>
+            </w:r>
+            <w:proofErr w:type="spellEnd"/>
+            <w:r>
+              <w:rPr>
+                <w:rFonts w:ascii="Verdana" w:eastAsia="Verdana" w:hAnsi="Verdana" w:cs="Verdana"/>
+                <w:color w:val="1F2A44"/>
+                <w:sz w:val="17"/>
+                <w:szCs w:val="17"/>
+              </w:rPr>
+              <w:t>) {</w:t>
+            </w:r>
+            <w:proofErr w:type="gramEnd"/>
+          </w:p>
+          <w:p>
+            <w:pPr>
+              <w:spacing w:after="0"/>
+            </w:pPr>
+            <w:r>
+              <w:rPr>
+                <w:rFonts w:ascii="Verdana" w:eastAsia="Verdana" w:hAnsi="Verdana" w:cs="Verdana"/>
+                <w:color w:val="1F2A44"/>
+                <w:sz w:val="17"/>
+                <w:szCs w:val="17"/>
+              </w:rPr>
+              <w:t xml:space="preserve">    throw new </w:t>
+            </w:r>
+            <w:proofErr w:type="gramStart"/>
+            <w:r>
+              <w:rPr>
+                <w:rFonts w:ascii="Verdana" w:eastAsia="Verdana" w:hAnsi="Verdana" w:cs="Verdana"/>
+                <w:color w:val="1F2A44"/>
+                <w:sz w:val="17"/>
+                <w:szCs w:val="17"/>
+              </w:rPr>
+              <w:t>Error(</w:t>
+            </w:r>
+            <w:proofErr w:type="gramEnd"/>
+            <w:r>
+              <w:rPr>
+                <w:rFonts w:ascii="Verdana" w:eastAsia="Verdana" w:hAnsi="Verdana" w:cs="Verdana"/>
+                <w:color w:val="1F2A44"/>
+                <w:sz w:val="17"/>
+                <w:szCs w:val="17"/>
+              </w:rPr>
+              <w:t xml:space="preserve">'status ' + </w:t>
+            </w:r>
+            <w:proofErr w:type="spellStart"/>
+            <w:proofErr w:type="gramStart"/>
+            <w:r>
+              <w:rPr>
+                <w:rFonts w:ascii="Verdana" w:eastAsia="Verdana" w:hAnsi="Verdana" w:cs="Verdana"/>
+                <w:color w:val="1F2A44"/>
+                <w:sz w:val="17"/>
+                <w:szCs w:val="17"/>
+              </w:rPr>
+              <w:t>respons.status</w:t>
+            </w:r>
+            <w:proofErr w:type="spellEnd"/>
+            <w:proofErr w:type="gramEnd"/>
+            <w:r>
+              <w:rPr>
+                <w:rFonts w:ascii="Verdana" w:eastAsia="Verdana" w:hAnsi="Verdana" w:cs="Verdana"/>
+                <w:color w:val="1F2A44"/>
+                <w:sz w:val="17"/>
+                <w:szCs w:val="17"/>
+              </w:rPr>
+              <w:t>);</w:t>
+            </w:r>
+          </w:p>
+          <w:p>
+            <w:pPr>
+              <w:spacing w:after="0"/>
+            </w:pPr>
+            <w:r>
+              <w:rPr>
+                <w:rFonts w:ascii="Verdana" w:eastAsia="Verdana" w:hAnsi="Verdana" w:cs="Verdana"/>
+                <w:color w:val="1F2A44"/>
+                <w:sz w:val="17"/>
+                <w:szCs w:val="17"/>
+              </w:rPr>
+              <w:t xml:space="preserve">  }</w:t>
+            </w:r>
+          </w:p>
+          <w:p>
+            <w:pPr>
+              <w:spacing w:after="0"/>
+            </w:pPr>
+            <w:r>
+              <w:rPr>
+                <w:rFonts w:ascii="Verdana" w:eastAsia="Verdana" w:hAnsi="Verdana" w:cs="Verdana"/>
+                <w:color w:val="1F2A44"/>
+                <w:sz w:val="17"/>
+                <w:szCs w:val="17"/>
+              </w:rPr>
+              <w:t xml:space="preserve">  return </w:t>
+            </w:r>
+            <w:proofErr w:type="spellStart"/>
+            <w:proofErr w:type="gramStart"/>
+            <w:r>
+              <w:rPr>
+                <w:rFonts w:ascii="Verdana" w:eastAsia="Verdana" w:hAnsi="Verdana" w:cs="Verdana"/>
+                <w:color w:val="1F2A44"/>
+                <w:sz w:val="17"/>
+                <w:szCs w:val="17"/>
+              </w:rPr>
               <w:t>respons.json</w:t>
             </w:r>
             <w:proofErr w:type="spellEnd"/>
+            <w:proofErr w:type="gramEnd"/>
             <w:r>
               <w:rPr>
                 <w:rFonts w:ascii="Verdana" w:eastAsia="Verdana" w:hAnsi="Verdana" w:cs="Verdana"/>
@@ -10120,6 +10334,7 @@
               <w:t xml:space="preserve">Nilai </w:t>
             </w:r>
             <w:proofErr w:type="spellStart"/>
+            <w:proofErr w:type="gramStart"/>
             <w:r>
               <w:rPr>
                 <w:color w:val="1A1A2E"/>
@@ -10129,6 +10344,7 @@
               <w:t>respons.ok</w:t>
             </w:r>
             <w:proofErr w:type="spellEnd"/>
+            <w:proofErr w:type="gramEnd"/>
           </w:p>
         </w:tc>
         <w:tc>
@@ -10241,7 +10457,7 @@
                     <pic:cNvPicPr/>
                   </pic:nvPicPr>
                   <pic:blipFill>
-                    <a:blip r:embed="rId6"/>
+                    <a:blip r:embed="rId7"/>
                     <a:stretch>
                       <a:fillRect/>
                     </a:stretch>
@@ -10288,7 +10504,7 @@
                     <pic:cNvPicPr/>
                   </pic:nvPicPr>
                   <pic:blipFill>
-                    <a:blip r:embed="rId7"/>
+                    <a:blip r:embed="rId8"/>
                     <a:stretch>
                       <a:fillRect/>
                     </a:stretch>
@@ -10567,6 +10783,7 @@
               <w:t xml:space="preserve"> </w:t>
             </w:r>
             <w:proofErr w:type="spellStart"/>
+            <w:proofErr w:type="gramStart"/>
             <w:r>
               <w:rPr>
                 <w:color w:val="1A1A2E"/>
@@ -10582,7 +10799,16 @@
                 <w:sz w:val="19"/>
                 <w:szCs w:val="19"/>
               </w:rPr>
-              <w:t xml:space="preserve">(), </w:t>
+              <w:t>(</w:t>
+            </w:r>
+            <w:proofErr w:type="gramEnd"/>
+            <w:r>
+              <w:rPr>
+                <w:color w:val="1A1A2E"/>
+                <w:sz w:val="19"/>
+                <w:szCs w:val="19"/>
+              </w:rPr>
+              <w:t xml:space="preserve">), </w:t>
             </w:r>
             <w:proofErr w:type="spellStart"/>
             <w:r>
@@ -10752,6 +10978,7 @@
             <w:pPr>
               <w:spacing w:after="0"/>
             </w:pPr>
+            <w:proofErr w:type="gramStart"/>
             <w:r>
               <w:rPr>
                 <w:b/>
@@ -10764,7 +10991,14 @@
               <w:rPr>
                 <w:color w:val="FFFFFF"/>
               </w:rPr>
-              <w:t>SIMPAN KE GIT - SETELAH LEMBAR A</w:t>
+              <w:t>SIMPAN</w:t>
+            </w:r>
+            <w:proofErr w:type="gramEnd"/>
+            <w:r>
+              <w:rPr>
+                <w:color w:val="FFFFFF"/>
+              </w:rPr>
+              <w:t xml:space="preserve"> KE GIT - SETELAH LEMBAR A</w:t>
             </w:r>
           </w:p>
         </w:tc>
@@ -10815,8 +11049,19 @@
                 <w:sz w:val="17"/>
                 <w:szCs w:val="17"/>
               </w:rPr>
-              <w:t>git add .</w:t>
-            </w:r>
+              <w:t xml:space="preserve">git </w:t>
+            </w:r>
+            <w:proofErr w:type="gramStart"/>
+            <w:r>
+              <w:rPr>
+                <w:rFonts w:ascii="Verdana" w:eastAsia="Verdana" w:hAnsi="Verdana" w:cs="Verdana"/>
+                <w:color w:val="1F2A44"/>
+                <w:sz w:val="17"/>
+                <w:szCs w:val="17"/>
+              </w:rPr>
+              <w:t>add .</w:t>
+            </w:r>
+            <w:proofErr w:type="gramEnd"/>
           </w:p>
           <w:p>
             <w:pPr>
@@ -11615,6 +11860,7 @@
         <w:t xml:space="preserve"> </w:t>
       </w:r>
       <w:proofErr w:type="spellStart"/>
+      <w:proofErr w:type="gramStart"/>
       <w:r>
         <w:rPr>
           <w:i/>
@@ -11634,9 +11880,9 @@
           <w:sz w:val="19"/>
           <w:szCs w:val="19"/>
         </w:rPr>
-        <w:t xml:space="preserve">() Anda. Status dan </w:t>
-      </w:r>
-      <w:proofErr w:type="spellStart"/>
+        <w:t>(</w:t>
+      </w:r>
+      <w:proofErr w:type="gramEnd"/>
       <w:r>
         <w:rPr>
           <w:i/>
@@ -11645,9 +11891,9 @@
           <w:sz w:val="19"/>
           <w:szCs w:val="19"/>
         </w:rPr>
-        <w:t>nilai</w:t>
-      </w:r>
-      <w:proofErr w:type="spellEnd"/>
+        <w:t xml:space="preserve">) Anda. Status dan </w:t>
+      </w:r>
+      <w:proofErr w:type="spellStart"/>
       <w:r>
         <w:rPr>
           <w:i/>
@@ -11656,9 +11902,9 @@
           <w:sz w:val="19"/>
           <w:szCs w:val="19"/>
         </w:rPr>
-        <w:t xml:space="preserve"> </w:t>
-      </w:r>
-      <w:proofErr w:type="spellStart"/>
+        <w:t>nilai</w:t>
+      </w:r>
+      <w:proofErr w:type="spellEnd"/>
       <w:r>
         <w:rPr>
           <w:i/>
@@ -11667,9 +11913,22 @@
           <w:sz w:val="19"/>
           <w:szCs w:val="19"/>
         </w:rPr>
+        <w:t xml:space="preserve"> </w:t>
+      </w:r>
+      <w:proofErr w:type="spellStart"/>
+      <w:proofErr w:type="gramStart"/>
+      <w:r>
+        <w:rPr>
+          <w:i/>
+          <w:iCs/>
+          <w:color w:val="5A6080"/>
+          <w:sz w:val="19"/>
+          <w:szCs w:val="19"/>
+        </w:rPr>
         <w:t>respons.ok</w:t>
       </w:r>
       <w:proofErr w:type="spellEnd"/>
+      <w:proofErr w:type="gramEnd"/>
       <w:r>
         <w:rPr>
           <w:i/>
@@ -11913,26 +12172,36 @@
             <w:pPr>
               <w:spacing w:after="0"/>
             </w:pPr>
+            <w:proofErr w:type="gramStart"/>
             <w:r>
               <w:rPr>
                 <w:color w:val="FFFFFF"/>
                 <w:sz w:val="17"/>
                 <w:szCs w:val="17"/>
               </w:rPr>
-              <w:t>▌  SATU try/catch MENUTUP SELURUH RANTAI</w:t>
-            </w:r>
-          </w:p>
-          <w:p>
-            <w:pPr>
-              <w:spacing w:after="0"/>
-            </w:pPr>
-            <w:proofErr w:type="spellStart"/>
+              <w:t>▌  SATU</w:t>
+            </w:r>
+            <w:proofErr w:type="gramEnd"/>
             <w:r>
               <w:rPr>
                 <w:color w:val="FFFFFF"/>
                 <w:sz w:val="17"/>
                 <w:szCs w:val="17"/>
               </w:rPr>
+              <w:t xml:space="preserve"> try/catch MENUTUP SELURUH RANTAI</w:t>
+            </w:r>
+          </w:p>
+          <w:p>
+            <w:pPr>
+              <w:spacing w:after="0"/>
+            </w:pPr>
+            <w:proofErr w:type="spellStart"/>
+            <w:r>
+              <w:rPr>
+                <w:color w:val="FFFFFF"/>
+                <w:sz w:val="17"/>
+                <w:szCs w:val="17"/>
+              </w:rPr>
               <w:t>Rantai</w:t>
             </w:r>
             <w:proofErr w:type="spellEnd"/>
@@ -12050,7 +12319,25 @@
                 <w:sz w:val="17"/>
                 <w:szCs w:val="17"/>
               </w:rPr>
-              <w:t xml:space="preserve">. async dan await </w:t>
+              <w:t xml:space="preserve">. async dan </w:t>
+            </w:r>
+            <w:proofErr w:type="gramStart"/>
+            <w:r>
+              <w:rPr>
+                <w:color w:val="FFFFFF"/>
+                <w:sz w:val="17"/>
+                <w:szCs w:val="17"/>
+              </w:rPr>
+              <w:t>await</w:t>
+            </w:r>
+            <w:proofErr w:type="gramEnd"/>
+            <w:r>
+              <w:rPr>
+                <w:color w:val="FFFFFF"/>
+                <w:sz w:val="17"/>
+                <w:szCs w:val="17"/>
+              </w:rPr>
+              <w:t xml:space="preserve"> </w:t>
             </w:r>
             <w:proofErr w:type="spellStart"/>
             <w:r>
@@ -12299,6 +12586,7 @@
       <w:pPr>
         <w:spacing w:before="280" w:after="80"/>
       </w:pPr>
+      <w:proofErr w:type="gramStart"/>
       <w:r>
         <w:rPr>
           <w:b/>
@@ -12307,7 +12595,18 @@
           <w:sz w:val="22"/>
           <w:szCs w:val="22"/>
         </w:rPr>
-        <w:t xml:space="preserve">B.1  Ubah </w:t>
+        <w:t>B.1  Ubah</w:t>
+      </w:r>
+      <w:proofErr w:type="gramEnd"/>
+      <w:r>
+        <w:rPr>
+          <w:b/>
+          <w:bCs/>
+          <w:color w:val="003796"/>
+          <w:sz w:val="22"/>
+          <w:szCs w:val="22"/>
+        </w:rPr>
+        <w:t xml:space="preserve"> </w:t>
       </w:r>
       <w:proofErr w:type="spellStart"/>
       <w:r>
@@ -12560,6 +12859,7 @@
               <w:t xml:space="preserve">export async function </w:t>
             </w:r>
             <w:proofErr w:type="spellStart"/>
+            <w:proofErr w:type="gramStart"/>
             <w:r>
               <w:rPr>
                 <w:rFonts w:ascii="Verdana" w:eastAsia="Verdana" w:hAnsi="Verdana" w:cs="Verdana"/>
@@ -12577,13 +12877,9 @@
                 <w:sz w:val="17"/>
                 <w:szCs w:val="17"/>
               </w:rPr>
-              <w:t>() {</w:t>
-            </w:r>
-          </w:p>
-          <w:p>
-            <w:pPr>
-              <w:spacing w:after="0"/>
-            </w:pPr>
+              <w:t>(</w:t>
+            </w:r>
+            <w:proofErr w:type="gramEnd"/>
             <w:r>
               <w:rPr>
                 <w:rFonts w:ascii="Verdana" w:eastAsia="Verdana" w:hAnsi="Verdana" w:cs="Verdana"/>
@@ -12591,7 +12887,7 @@
                 <w:sz w:val="17"/>
                 <w:szCs w:val="17"/>
               </w:rPr>
-              <w:t xml:space="preserve">  try {</w:t>
+              <w:t>) {</w:t>
             </w:r>
           </w:p>
           <w:p>
@@ -12605,9 +12901,13 @@
                 <w:sz w:val="17"/>
                 <w:szCs w:val="17"/>
               </w:rPr>
-              <w:t xml:space="preserve">    const </w:t>
-            </w:r>
-            <w:proofErr w:type="spellStart"/>
+              <w:t xml:space="preserve">  try {</w:t>
+            </w:r>
+          </w:p>
+          <w:p>
+            <w:pPr>
+              <w:spacing w:after="0"/>
+            </w:pPr>
             <w:r>
               <w:rPr>
                 <w:rFonts w:ascii="Verdana" w:eastAsia="Verdana" w:hAnsi="Verdana" w:cs="Verdana"/>
@@ -12615,9 +12915,9 @@
                 <w:sz w:val="17"/>
                 <w:szCs w:val="17"/>
               </w:rPr>
-              <w:t>respons</w:t>
-            </w:r>
-            <w:proofErr w:type="spellEnd"/>
+              <w:t xml:space="preserve">    const </w:t>
+            </w:r>
+            <w:proofErr w:type="spellStart"/>
             <w:r>
               <w:rPr>
                 <w:rFonts w:ascii="Verdana" w:eastAsia="Verdana" w:hAnsi="Verdana" w:cs="Verdana"/>
@@ -12625,13 +12925,9 @@
                 <w:sz w:val="17"/>
                 <w:szCs w:val="17"/>
               </w:rPr>
-              <w:t xml:space="preserve"> = await fetch(ALAMAT);</w:t>
-            </w:r>
-          </w:p>
-          <w:p>
-            <w:pPr>
-              <w:spacing w:after="0"/>
-            </w:pPr>
+              <w:t>respons</w:t>
+            </w:r>
+            <w:proofErr w:type="spellEnd"/>
             <w:r>
               <w:rPr>
                 <w:rFonts w:ascii="Verdana" w:eastAsia="Verdana" w:hAnsi="Verdana" w:cs="Verdana"/>
@@ -12639,9 +12935,9 @@
                 <w:sz w:val="17"/>
                 <w:szCs w:val="17"/>
               </w:rPr>
-              <w:t xml:space="preserve">    if (!</w:t>
-            </w:r>
-            <w:proofErr w:type="spellStart"/>
+              <w:t xml:space="preserve"> = await </w:t>
+            </w:r>
+            <w:proofErr w:type="gramStart"/>
             <w:r>
               <w:rPr>
                 <w:rFonts w:ascii="Verdana" w:eastAsia="Verdana" w:hAnsi="Verdana" w:cs="Verdana"/>
@@ -12649,9 +12945,9 @@
                 <w:sz w:val="17"/>
                 <w:szCs w:val="17"/>
               </w:rPr>
-              <w:t>respons.ok</w:t>
-            </w:r>
-            <w:proofErr w:type="spellEnd"/>
+              <w:t>fetch(</w:t>
+            </w:r>
+            <w:proofErr w:type="gramEnd"/>
             <w:r>
               <w:rPr>
                 <w:rFonts w:ascii="Verdana" w:eastAsia="Verdana" w:hAnsi="Verdana" w:cs="Verdana"/>
@@ -12659,9 +12955,13 @@
                 <w:sz w:val="17"/>
                 <w:szCs w:val="17"/>
               </w:rPr>
-              <w:t xml:space="preserve">) throw new Error('status ' + </w:t>
-            </w:r>
-            <w:proofErr w:type="spellStart"/>
+              <w:t>ALAMAT);</w:t>
+            </w:r>
+          </w:p>
+          <w:p>
+            <w:pPr>
+              <w:spacing w:after="0"/>
+            </w:pPr>
             <w:r>
               <w:rPr>
                 <w:rFonts w:ascii="Verdana" w:eastAsia="Verdana" w:hAnsi="Verdana" w:cs="Verdana"/>
@@ -12669,9 +12969,9 @@
                 <w:sz w:val="17"/>
                 <w:szCs w:val="17"/>
               </w:rPr>
-              <w:t>respons.status</w:t>
-            </w:r>
-            <w:proofErr w:type="spellEnd"/>
+              <w:t xml:space="preserve">    if </w:t>
+            </w:r>
+            <w:proofErr w:type="gramStart"/>
             <w:r>
               <w:rPr>
                 <w:rFonts w:ascii="Verdana" w:eastAsia="Verdana" w:hAnsi="Verdana" w:cs="Verdana"/>
@@ -12679,13 +12979,9 @@
                 <w:sz w:val="17"/>
                 <w:szCs w:val="17"/>
               </w:rPr>
-              <w:t>);</w:t>
-            </w:r>
-          </w:p>
-          <w:p>
-            <w:pPr>
-              <w:spacing w:after="0"/>
-            </w:pPr>
+              <w:t>(!</w:t>
+            </w:r>
+            <w:proofErr w:type="spellStart"/>
             <w:r>
               <w:rPr>
                 <w:rFonts w:ascii="Verdana" w:eastAsia="Verdana" w:hAnsi="Verdana" w:cs="Verdana"/>
@@ -12693,9 +12989,9 @@
                 <w:sz w:val="17"/>
                 <w:szCs w:val="17"/>
               </w:rPr>
-              <w:t xml:space="preserve">    const data = await </w:t>
-            </w:r>
-            <w:proofErr w:type="spellStart"/>
+              <w:t>respons</w:t>
+            </w:r>
+            <w:proofErr w:type="gramEnd"/>
             <w:r>
               <w:rPr>
                 <w:rFonts w:ascii="Verdana" w:eastAsia="Verdana" w:hAnsi="Verdana" w:cs="Verdana"/>
@@ -12703,7 +12999,7 @@
                 <w:sz w:val="17"/>
                 <w:szCs w:val="17"/>
               </w:rPr>
-              <w:t>respons.json</w:t>
+              <w:t>.ok</w:t>
             </w:r>
             <w:proofErr w:type="spellEnd"/>
             <w:r>
@@ -12713,13 +13009,9 @@
                 <w:sz w:val="17"/>
                 <w:szCs w:val="17"/>
               </w:rPr>
-              <w:t>();</w:t>
-            </w:r>
-          </w:p>
-          <w:p>
-            <w:pPr>
-              <w:spacing w:after="0"/>
-            </w:pPr>
+              <w:t xml:space="preserve">) throw new </w:t>
+            </w:r>
+            <w:proofErr w:type="gramStart"/>
             <w:r>
               <w:rPr>
                 <w:rFonts w:ascii="Verdana" w:eastAsia="Verdana" w:hAnsi="Verdana" w:cs="Verdana"/>
@@ -12727,13 +13019,9 @@
                 <w:sz w:val="17"/>
                 <w:szCs w:val="17"/>
               </w:rPr>
-              <w:t xml:space="preserve">    return data;</w:t>
-            </w:r>
-          </w:p>
-          <w:p>
-            <w:pPr>
-              <w:spacing w:after="0"/>
-            </w:pPr>
+              <w:t>Error(</w:t>
+            </w:r>
+            <w:proofErr w:type="gramEnd"/>
             <w:r>
               <w:rPr>
                 <w:rFonts w:ascii="Verdana" w:eastAsia="Verdana" w:hAnsi="Verdana" w:cs="Verdana"/>
@@ -12741,9 +13029,10 @@
                 <w:sz w:val="17"/>
                 <w:szCs w:val="17"/>
               </w:rPr>
-              <w:t xml:space="preserve">  } catch (</w:t>
-            </w:r>
-            <w:proofErr w:type="spellStart"/>
+              <w:t xml:space="preserve">'status ' + </w:t>
+            </w:r>
+            <w:proofErr w:type="spellStart"/>
+            <w:proofErr w:type="gramStart"/>
             <w:r>
               <w:rPr>
                 <w:rFonts w:ascii="Verdana" w:eastAsia="Verdana" w:hAnsi="Verdana" w:cs="Verdana"/>
@@ -12751,9 +13040,10 @@
                 <w:sz w:val="17"/>
                 <w:szCs w:val="17"/>
               </w:rPr>
-              <w:t>galat</w:t>
-            </w:r>
-            <w:proofErr w:type="spellEnd"/>
+              <w:t>respons.status</w:t>
+            </w:r>
+            <w:proofErr w:type="spellEnd"/>
+            <w:proofErr w:type="gramEnd"/>
             <w:r>
               <w:rPr>
                 <w:rFonts w:ascii="Verdana" w:eastAsia="Verdana" w:hAnsi="Verdana" w:cs="Verdana"/>
@@ -12761,7 +13051,7 @@
                 <w:sz w:val="17"/>
                 <w:szCs w:val="17"/>
               </w:rPr>
-              <w:t>) {</w:t>
+              <w:t>);</w:t>
             </w:r>
           </w:p>
           <w:p>
@@ -12775,9 +13065,10 @@
                 <w:sz w:val="17"/>
                 <w:szCs w:val="17"/>
               </w:rPr>
-              <w:t xml:space="preserve">    </w:t>
-            </w:r>
-            <w:proofErr w:type="spellStart"/>
+              <w:t xml:space="preserve">    const data = await </w:t>
+            </w:r>
+            <w:proofErr w:type="spellStart"/>
+            <w:proofErr w:type="gramStart"/>
             <w:r>
               <w:rPr>
                 <w:rFonts w:ascii="Verdana" w:eastAsia="Verdana" w:hAnsi="Verdana" w:cs="Verdana"/>
@@ -12785,9 +13076,10 @@
                 <w:sz w:val="17"/>
                 <w:szCs w:val="17"/>
               </w:rPr>
-              <w:t>console.error</w:t>
-            </w:r>
-            <w:proofErr w:type="spellEnd"/>
+              <w:t>respons.json</w:t>
+            </w:r>
+            <w:proofErr w:type="spellEnd"/>
+            <w:proofErr w:type="gramEnd"/>
             <w:r>
               <w:rPr>
                 <w:rFonts w:ascii="Verdana" w:eastAsia="Verdana" w:hAnsi="Verdana" w:cs="Verdana"/>
@@ -12795,9 +13087,13 @@
                 <w:sz w:val="17"/>
                 <w:szCs w:val="17"/>
               </w:rPr>
-              <w:t>('</w:t>
-            </w:r>
-            <w:proofErr w:type="spellStart"/>
+              <w:t>();</w:t>
+            </w:r>
+          </w:p>
+          <w:p>
+            <w:pPr>
+              <w:spacing w:after="0"/>
+            </w:pPr>
             <w:r>
               <w:rPr>
                 <w:rFonts w:ascii="Verdana" w:eastAsia="Verdana" w:hAnsi="Verdana" w:cs="Verdana"/>
@@ -12805,9 +13101,13 @@
                 <w:sz w:val="17"/>
                 <w:szCs w:val="17"/>
               </w:rPr>
-              <w:t>gagal</w:t>
-            </w:r>
-            <w:proofErr w:type="spellEnd"/>
+              <w:t xml:space="preserve">    return data;</w:t>
+            </w:r>
+          </w:p>
+          <w:p>
+            <w:pPr>
+              <w:spacing w:after="0"/>
+            </w:pPr>
             <w:r>
               <w:rPr>
                 <w:rFonts w:ascii="Verdana" w:eastAsia="Verdana" w:hAnsi="Verdana" w:cs="Verdana"/>
@@ -12815,9 +13115,10 @@
                 <w:sz w:val="17"/>
                 <w:szCs w:val="17"/>
               </w:rPr>
-              <w:t xml:space="preserve"> </w:t>
-            </w:r>
-            <w:proofErr w:type="spellStart"/>
+              <w:t xml:space="preserve">  } catch (</w:t>
+            </w:r>
+            <w:proofErr w:type="spellStart"/>
+            <w:proofErr w:type="gramStart"/>
             <w:r>
               <w:rPr>
                 <w:rFonts w:ascii="Verdana" w:eastAsia="Verdana" w:hAnsi="Verdana" w:cs="Verdana"/>
@@ -12825,7 +13126,7 @@
                 <w:sz w:val="17"/>
                 <w:szCs w:val="17"/>
               </w:rPr>
-              <w:t>memuat</w:t>
+              <w:t>galat</w:t>
             </w:r>
             <w:proofErr w:type="spellEnd"/>
             <w:r>
@@ -12835,9 +13136,14 @@
                 <w:sz w:val="17"/>
                 <w:szCs w:val="17"/>
               </w:rPr>
-              <w:t xml:space="preserve">', </w:t>
-            </w:r>
-            <w:proofErr w:type="spellStart"/>
+              <w:t>) {</w:t>
+            </w:r>
+            <w:proofErr w:type="gramEnd"/>
+          </w:p>
+          <w:p>
+            <w:pPr>
+              <w:spacing w:after="0"/>
+            </w:pPr>
             <w:r>
               <w:rPr>
                 <w:rFonts w:ascii="Verdana" w:eastAsia="Verdana" w:hAnsi="Verdana" w:cs="Verdana"/>
@@ -12845,9 +13151,83 @@
                 <w:sz w:val="17"/>
                 <w:szCs w:val="17"/>
               </w:rPr>
+              <w:t xml:space="preserve">    </w:t>
+            </w:r>
+            <w:proofErr w:type="spellStart"/>
+            <w:proofErr w:type="gramStart"/>
+            <w:r>
+              <w:rPr>
+                <w:rFonts w:ascii="Verdana" w:eastAsia="Verdana" w:hAnsi="Verdana" w:cs="Verdana"/>
+                <w:color w:val="1F2A44"/>
+                <w:sz w:val="17"/>
+                <w:szCs w:val="17"/>
+              </w:rPr>
+              <w:t>console.error</w:t>
+            </w:r>
+            <w:proofErr w:type="spellEnd"/>
+            <w:proofErr w:type="gramEnd"/>
+            <w:r>
+              <w:rPr>
+                <w:rFonts w:ascii="Verdana" w:eastAsia="Verdana" w:hAnsi="Verdana" w:cs="Verdana"/>
+                <w:color w:val="1F2A44"/>
+                <w:sz w:val="17"/>
+                <w:szCs w:val="17"/>
+              </w:rPr>
+              <w:t>('</w:t>
+            </w:r>
+            <w:proofErr w:type="spellStart"/>
+            <w:r>
+              <w:rPr>
+                <w:rFonts w:ascii="Verdana" w:eastAsia="Verdana" w:hAnsi="Verdana" w:cs="Verdana"/>
+                <w:color w:val="1F2A44"/>
+                <w:sz w:val="17"/>
+                <w:szCs w:val="17"/>
+              </w:rPr>
+              <w:t>gagal</w:t>
+            </w:r>
+            <w:proofErr w:type="spellEnd"/>
+            <w:r>
+              <w:rPr>
+                <w:rFonts w:ascii="Verdana" w:eastAsia="Verdana" w:hAnsi="Verdana" w:cs="Verdana"/>
+                <w:color w:val="1F2A44"/>
+                <w:sz w:val="17"/>
+                <w:szCs w:val="17"/>
+              </w:rPr>
+              <w:t xml:space="preserve"> </w:t>
+            </w:r>
+            <w:proofErr w:type="spellStart"/>
+            <w:r>
+              <w:rPr>
+                <w:rFonts w:ascii="Verdana" w:eastAsia="Verdana" w:hAnsi="Verdana" w:cs="Verdana"/>
+                <w:color w:val="1F2A44"/>
+                <w:sz w:val="17"/>
+                <w:szCs w:val="17"/>
+              </w:rPr>
+              <w:t>memuat</w:t>
+            </w:r>
+            <w:proofErr w:type="spellEnd"/>
+            <w:r>
+              <w:rPr>
+                <w:rFonts w:ascii="Verdana" w:eastAsia="Verdana" w:hAnsi="Verdana" w:cs="Verdana"/>
+                <w:color w:val="1F2A44"/>
+                <w:sz w:val="17"/>
+                <w:szCs w:val="17"/>
+              </w:rPr>
+              <w:t xml:space="preserve">', </w:t>
+            </w:r>
+            <w:proofErr w:type="spellStart"/>
+            <w:proofErr w:type="gramStart"/>
+            <w:r>
+              <w:rPr>
+                <w:rFonts w:ascii="Verdana" w:eastAsia="Verdana" w:hAnsi="Verdana" w:cs="Verdana"/>
+                <w:color w:val="1F2A44"/>
+                <w:sz w:val="17"/>
+                <w:szCs w:val="17"/>
+              </w:rPr>
               <w:t>galat.message</w:t>
             </w:r>
             <w:proofErr w:type="spellEnd"/>
+            <w:proofErr w:type="gramEnd"/>
             <w:r>
               <w:rPr>
                 <w:rFonts w:ascii="Verdana" w:eastAsia="Verdana" w:hAnsi="Verdana" w:cs="Verdana"/>
@@ -13335,13 +13715,51 @@
     </w:tbl>
     <w:p>
       <w:pPr>
-        <w:spacing w:after="0" w:line="40" w:lineRule="auto"/>
+        <w:spacing w:after="0" w:line="240" w:lineRule="auto"/>
       </w:pPr>
+      <w:r>
+        <w:drawing>
+          <wp:inline distT="0" distB="0" distL="0" distR="0" wp14:anchorId="756DFCE4" wp14:editId="178B9F95">
+            <wp:extent cx="4838949" cy="2349621"/>
+            <wp:effectExtent l="0" t="0" r="0" b="0"/>
+            <wp:docPr id="2128699602" name="Picture 1"/>
+            <wp:cNvGraphicFramePr>
+              <a:graphicFrameLocks xmlns:a="http://schemas.openxmlformats.org/drawingml/2006/main" noChangeAspect="1"/>
+            </wp:cNvGraphicFramePr>
+            <a:graphic xmlns:a="http://schemas.openxmlformats.org/drawingml/2006/main">
+              <a:graphicData uri="http://schemas.openxmlformats.org/drawingml/2006/picture">
+                <pic:pic xmlns:pic="http://schemas.openxmlformats.org/drawingml/2006/picture">
+                  <pic:nvPicPr>
+                    <pic:cNvPr id="2128699602" name=""/>
+                    <pic:cNvPicPr/>
+                  </pic:nvPicPr>
+                  <pic:blipFill>
+                    <a:blip r:embed="rId9"/>
+                    <a:stretch>
+                      <a:fillRect/>
+                    </a:stretch>
+                  </pic:blipFill>
+                  <pic:spPr>
+                    <a:xfrm>
+                      <a:off x="0" y="0"/>
+                      <a:ext cx="4838949" cy="2349621"/>
+                    </a:xfrm>
+                    <a:prstGeom prst="rect">
+                      <a:avLst/>
+                    </a:prstGeom>
+                  </pic:spPr>
+                </pic:pic>
+              </a:graphicData>
+            </a:graphic>
+          </wp:inline>
+        </w:drawing>
+      </w:r>
     </w:p>
     <w:p>
       <w:pPr>
         <w:spacing w:before="280" w:after="80"/>
       </w:pPr>
+      <w:proofErr w:type="gramStart"/>
       <w:r>
         <w:rPr>
           <w:b/>
@@ -13350,7 +13768,18 @@
           <w:sz w:val="22"/>
           <w:szCs w:val="22"/>
         </w:rPr>
-        <w:t xml:space="preserve">B.2  Kenali </w:t>
+        <w:t>B.2  Kenali</w:t>
+      </w:r>
+      <w:proofErr w:type="gramEnd"/>
+      <w:r>
+        <w:rPr>
+          <w:b/>
+          <w:bCs/>
+          <w:color w:val="003796"/>
+          <w:sz w:val="22"/>
+          <w:szCs w:val="22"/>
+        </w:rPr>
+        <w:t xml:space="preserve"> </w:t>
       </w:r>
       <w:proofErr w:type="spellStart"/>
       <w:r>
@@ -13837,6 +14266,7 @@
               <w:t xml:space="preserve"> </w:t>
             </w:r>
             <w:proofErr w:type="spellStart"/>
+            <w:proofErr w:type="gramStart"/>
             <w:r>
               <w:rPr>
                 <w:color w:val="1A1A2E"/>
@@ -13846,6 +14276,7 @@
               <w:t>respons.ok</w:t>
             </w:r>
             <w:proofErr w:type="spellEnd"/>
+            <w:proofErr w:type="gramEnd"/>
             <w:r>
               <w:rPr>
                 <w:color w:val="1A1A2E"/>
@@ -13971,6 +14402,7 @@
               <w:spacing w:after="0"/>
             </w:pPr>
             <w:proofErr w:type="spellStart"/>
+            <w:proofErr w:type="gramStart"/>
             <w:r>
               <w:rPr>
                 <w:color w:val="1A1A2E"/>
@@ -13986,7 +14418,16 @@
                 <w:sz w:val="18"/>
                 <w:szCs w:val="18"/>
               </w:rPr>
-              <w:t xml:space="preserve">() </w:t>
+              <w:t>(</w:t>
+            </w:r>
+            <w:proofErr w:type="gramEnd"/>
+            <w:r>
+              <w:rPr>
+                <w:color w:val="1A1A2E"/>
+                <w:sz w:val="18"/>
+                <w:szCs w:val="18"/>
+              </w:rPr>
+              <w:t xml:space="preserve">) </w:t>
             </w:r>
             <w:proofErr w:type="spellStart"/>
             <w:r>
@@ -14365,6 +14806,7 @@
       <w:pPr>
         <w:spacing w:before="280" w:after="80"/>
       </w:pPr>
+      <w:proofErr w:type="gramStart"/>
       <w:r>
         <w:rPr>
           <w:b/>
@@ -14387,6 +14829,7 @@
         <w:t>Buktikan</w:t>
       </w:r>
       <w:proofErr w:type="spellEnd"/>
+      <w:proofErr w:type="gramEnd"/>
       <w:r>
         <w:rPr>
           <w:b/>
@@ -14869,6 +15312,38 @@
             <w:pPr>
               <w:spacing w:after="0"/>
             </w:pPr>
+            <w:proofErr w:type="spellStart"/>
+            <w:r>
+              <w:t>Sesuai</w:t>
+            </w:r>
+            <w:proofErr w:type="spellEnd"/>
+            <w:r>
+              <w:t xml:space="preserve"> (</w:t>
+            </w:r>
+            <w:proofErr w:type="spellStart"/>
+            <w:r>
+              <w:t>lihat</w:t>
+            </w:r>
+            <w:proofErr w:type="spellEnd"/>
+            <w:r>
+              <w:t xml:space="preserve"> pada </w:t>
+            </w:r>
+            <w:proofErr w:type="spellStart"/>
+            <w:r>
+              <w:t>gambar</w:t>
+            </w:r>
+            <w:proofErr w:type="spellEnd"/>
+            <w:r>
+              <w:t xml:space="preserve"> </w:t>
+            </w:r>
+            <w:proofErr w:type="spellStart"/>
+            <w:r>
+              <w:t>dibawah</w:t>
+            </w:r>
+            <w:proofErr w:type="spellEnd"/>
+            <w:r>
+              <w:t>)</w:t>
+            </w:r>
           </w:p>
         </w:tc>
       </w:tr>
@@ -15041,6 +15516,38 @@
             <w:pPr>
               <w:spacing w:after="0"/>
             </w:pPr>
+            <w:proofErr w:type="spellStart"/>
+            <w:r>
+              <w:t>Sesuai</w:t>
+            </w:r>
+            <w:proofErr w:type="spellEnd"/>
+            <w:r>
+              <w:t xml:space="preserve"> (</w:t>
+            </w:r>
+            <w:proofErr w:type="spellStart"/>
+            <w:r>
+              <w:t>lihat</w:t>
+            </w:r>
+            <w:proofErr w:type="spellEnd"/>
+            <w:r>
+              <w:t xml:space="preserve"> pada </w:t>
+            </w:r>
+            <w:proofErr w:type="spellStart"/>
+            <w:r>
+              <w:t>gambar</w:t>
+            </w:r>
+            <w:proofErr w:type="spellEnd"/>
+            <w:r>
+              <w:t xml:space="preserve"> </w:t>
+            </w:r>
+            <w:proofErr w:type="spellStart"/>
+            <w:r>
+              <w:t>dibawah</w:t>
+            </w:r>
+            <w:proofErr w:type="spellEnd"/>
+            <w:r>
+              <w:t>)</w:t>
+            </w:r>
           </w:p>
         </w:tc>
       </w:tr>
@@ -15229,10 +15736,188 @@
             <w:pPr>
               <w:spacing w:after="0"/>
             </w:pPr>
+            <w:proofErr w:type="spellStart"/>
+            <w:r>
+              <w:t>Sesuai</w:t>
+            </w:r>
+            <w:proofErr w:type="spellEnd"/>
+            <w:r>
+              <w:t xml:space="preserve"> (</w:t>
+            </w:r>
+            <w:proofErr w:type="spellStart"/>
+            <w:r>
+              <w:t>lihat</w:t>
+            </w:r>
+            <w:proofErr w:type="spellEnd"/>
+            <w:r>
+              <w:t xml:space="preserve"> pada </w:t>
+            </w:r>
+            <w:proofErr w:type="spellStart"/>
+            <w:r>
+              <w:t>gambar</w:t>
+            </w:r>
+            <w:proofErr w:type="spellEnd"/>
+            <w:r>
+              <w:t xml:space="preserve"> </w:t>
+            </w:r>
+            <w:proofErr w:type="spellStart"/>
+            <w:r>
+              <w:t>dibawah</w:t>
+            </w:r>
+            <w:proofErr w:type="spellEnd"/>
+            <w:r>
+              <w:t>)</w:t>
+            </w:r>
           </w:p>
         </w:tc>
       </w:tr>
     </w:tbl>
+    <w:p>
+      <w:pPr>
+        <w:spacing w:after="0" w:line="240" w:lineRule="auto"/>
+      </w:pPr>
+      <w:r>
+        <w:drawing>
+          <wp:inline distT="0" distB="0" distL="0" distR="0" wp14:anchorId="16C3513C" wp14:editId="1D7C2C8C">
+            <wp:extent cx="3376246" cy="675249"/>
+            <wp:effectExtent l="0" t="0" r="0" b="0"/>
+            <wp:docPr id="1421143677" name="Picture 1"/>
+            <wp:cNvGraphicFramePr>
+              <a:graphicFrameLocks xmlns:a="http://schemas.openxmlformats.org/drawingml/2006/main" noChangeAspect="1"/>
+            </wp:cNvGraphicFramePr>
+            <a:graphic xmlns:a="http://schemas.openxmlformats.org/drawingml/2006/main">
+              <a:graphicData uri="http://schemas.openxmlformats.org/drawingml/2006/picture">
+                <pic:pic xmlns:pic="http://schemas.openxmlformats.org/drawingml/2006/picture">
+                  <pic:nvPicPr>
+                    <pic:cNvPr id="1421143677" name=""/>
+                    <pic:cNvPicPr/>
+                  </pic:nvPicPr>
+                  <pic:blipFill>
+                    <a:blip r:embed="rId10"/>
+                    <a:stretch>
+                      <a:fillRect/>
+                    </a:stretch>
+                  </pic:blipFill>
+                  <pic:spPr>
+                    <a:xfrm>
+                      <a:off x="0" y="0"/>
+                      <a:ext cx="3396813" cy="679362"/>
+                    </a:xfrm>
+                    <a:prstGeom prst="rect">
+                      <a:avLst/>
+                    </a:prstGeom>
+                  </pic:spPr>
+                </pic:pic>
+              </a:graphicData>
+            </a:graphic>
+          </wp:inline>
+        </w:drawing>
+      </w:r>
+    </w:p>
+    <w:p>
+      <w:pPr>
+        <w:spacing w:after="0" w:line="240" w:lineRule="auto"/>
+      </w:pPr>
+    </w:p>
+    <w:p>
+      <w:pPr>
+        <w:spacing w:after="0" w:line="240" w:lineRule="auto"/>
+      </w:pPr>
+      <w:r>
+        <w:drawing>
+          <wp:inline distT="0" distB="0" distL="0" distR="0" wp14:anchorId="72200EBB" wp14:editId="23B12612">
+            <wp:extent cx="3172265" cy="2320761"/>
+            <wp:effectExtent l="0" t="0" r="0" b="3810"/>
+            <wp:docPr id="244524658" name="Picture 1"/>
+            <wp:cNvGraphicFramePr>
+              <a:graphicFrameLocks xmlns:a="http://schemas.openxmlformats.org/drawingml/2006/main" noChangeAspect="1"/>
+            </wp:cNvGraphicFramePr>
+            <a:graphic xmlns:a="http://schemas.openxmlformats.org/drawingml/2006/main">
+              <a:graphicData uri="http://schemas.openxmlformats.org/drawingml/2006/picture">
+                <pic:pic xmlns:pic="http://schemas.openxmlformats.org/drawingml/2006/picture">
+                  <pic:nvPicPr>
+                    <pic:cNvPr id="244524658" name=""/>
+                    <pic:cNvPicPr/>
+                  </pic:nvPicPr>
+                  <pic:blipFill>
+                    <a:blip r:embed="rId11"/>
+                    <a:stretch>
+                      <a:fillRect/>
+                    </a:stretch>
+                  </pic:blipFill>
+                  <pic:spPr>
+                    <a:xfrm>
+                      <a:off x="0" y="0"/>
+                      <a:ext cx="3192476" cy="2335547"/>
+                    </a:xfrm>
+                    <a:prstGeom prst="rect">
+                      <a:avLst/>
+                    </a:prstGeom>
+                  </pic:spPr>
+                </pic:pic>
+              </a:graphicData>
+            </a:graphic>
+          </wp:inline>
+        </w:drawing>
+      </w:r>
+    </w:p>
+    <w:p>
+      <w:pPr>
+        <w:spacing w:after="0" w:line="240" w:lineRule="auto"/>
+      </w:pPr>
+      <w:r>
+        <w:drawing>
+          <wp:inline distT="0" distB="0" distL="0" distR="0" wp14:anchorId="64852E35" wp14:editId="3E80F9AC">
+            <wp:extent cx="3833446" cy="4194120"/>
+            <wp:effectExtent l="0" t="0" r="0" b="0"/>
+            <wp:docPr id="1047253901" name="Picture 1"/>
+            <wp:cNvGraphicFramePr>
+              <a:graphicFrameLocks xmlns:a="http://schemas.openxmlformats.org/drawingml/2006/main" noChangeAspect="1"/>
+            </wp:cNvGraphicFramePr>
+            <a:graphic xmlns:a="http://schemas.openxmlformats.org/drawingml/2006/main">
+              <a:graphicData uri="http://schemas.openxmlformats.org/drawingml/2006/picture">
+                <pic:pic xmlns:pic="http://schemas.openxmlformats.org/drawingml/2006/picture">
+                  <pic:nvPicPr>
+                    <pic:cNvPr id="1047253901" name=""/>
+                    <pic:cNvPicPr/>
+                  </pic:nvPicPr>
+                  <pic:blipFill>
+                    <a:blip r:embed="rId12"/>
+                    <a:stretch>
+                      <a:fillRect/>
+                    </a:stretch>
+                  </pic:blipFill>
+                  <pic:spPr>
+                    <a:xfrm>
+                      <a:off x="0" y="0"/>
+                      <a:ext cx="3837214" cy="4198242"/>
+                    </a:xfrm>
+                    <a:prstGeom prst="rect">
+                      <a:avLst/>
+                    </a:prstGeom>
+                  </pic:spPr>
+                </pic:pic>
+              </a:graphicData>
+            </a:graphic>
+          </wp:inline>
+        </w:drawing>
+      </w:r>
+    </w:p>
+    <w:p>
+      <w:pPr>
+        <w:spacing w:after="0" w:line="40" w:lineRule="auto"/>
+      </w:pPr>
+    </w:p>
+    <w:p>
+      <w:pPr>
+        <w:spacing w:after="0" w:line="40" w:lineRule="auto"/>
+      </w:pPr>
+    </w:p>
+    <w:p>
+      <w:pPr>
+        <w:spacing w:after="0" w:line="40" w:lineRule="auto"/>
+      </w:pPr>
+    </w:p>
     <w:p>
       <w:pPr>
         <w:spacing w:after="0" w:line="40" w:lineRule="auto"/>
@@ -15601,6 +16286,7 @@
             <w:pPr>
               <w:spacing w:after="0"/>
             </w:pPr>
+            <w:proofErr w:type="gramStart"/>
             <w:r>
               <w:rPr>
                 <w:b/>
@@ -15613,7 +16299,14 @@
               <w:rPr>
                 <w:color w:val="FFFFFF"/>
               </w:rPr>
-              <w:t>SIMPAN KE GIT - SETELAH LEMBAR B</w:t>
+              <w:t>SIMPAN</w:t>
+            </w:r>
+            <w:proofErr w:type="gramEnd"/>
+            <w:r>
+              <w:rPr>
+                <w:color w:val="FFFFFF"/>
+              </w:rPr>
+              <w:t xml:space="preserve"> KE GIT - SETELAH LEMBAR B</w:t>
             </w:r>
           </w:p>
         </w:tc>
@@ -15664,8 +16357,19 @@
                 <w:sz w:val="17"/>
                 <w:szCs w:val="17"/>
               </w:rPr>
-              <w:t>git add .</w:t>
-            </w:r>
+              <w:t xml:space="preserve">git </w:t>
+            </w:r>
+            <w:proofErr w:type="gramStart"/>
+            <w:r>
+              <w:rPr>
+                <w:rFonts w:ascii="Verdana" w:eastAsia="Verdana" w:hAnsi="Verdana" w:cs="Verdana"/>
+                <w:color w:val="1F2A44"/>
+                <w:sz w:val="17"/>
+                <w:szCs w:val="17"/>
+              </w:rPr>
+              <w:t>add .</w:t>
+            </w:r>
+            <w:proofErr w:type="gramEnd"/>
           </w:p>
           <w:p>
             <w:pPr>
@@ -16841,26 +17545,36 @@
             <w:pPr>
               <w:spacing w:after="0"/>
             </w:pPr>
+            <w:proofErr w:type="gramStart"/>
             <w:r>
               <w:rPr>
                 <w:color w:val="FFFFFF"/>
                 <w:sz w:val="17"/>
                 <w:szCs w:val="17"/>
               </w:rPr>
-              <w:t>▌  TEKS MASUK, NILAI KELUAR, DAN SEBALIKNYA</w:t>
-            </w:r>
-          </w:p>
-          <w:p>
-            <w:pPr>
-              <w:spacing w:after="0"/>
-            </w:pPr>
-            <w:proofErr w:type="spellStart"/>
+              <w:t>▌  TEKS</w:t>
+            </w:r>
+            <w:proofErr w:type="gramEnd"/>
             <w:r>
               <w:rPr>
                 <w:color w:val="FFFFFF"/>
                 <w:sz w:val="17"/>
                 <w:szCs w:val="17"/>
               </w:rPr>
+              <w:t xml:space="preserve"> MASUK, NILAI KELUAR, DAN SEBALIKNYA</w:t>
+            </w:r>
+          </w:p>
+          <w:p>
+            <w:pPr>
+              <w:spacing w:after="0"/>
+            </w:pPr>
+            <w:proofErr w:type="spellStart"/>
+            <w:r>
+              <w:rPr>
+                <w:color w:val="FFFFFF"/>
+                <w:sz w:val="17"/>
+                <w:szCs w:val="17"/>
+              </w:rPr>
               <w:t>Balasan</w:t>
             </w:r>
             <w:proofErr w:type="spellEnd"/>
@@ -16945,6 +17659,7 @@
               <w:t xml:space="preserve">. </w:t>
             </w:r>
             <w:proofErr w:type="spellStart"/>
+            <w:proofErr w:type="gramStart"/>
             <w:r>
               <w:rPr>
                 <w:color w:val="FFFFFF"/>
@@ -16960,7 +17675,16 @@
                 <w:sz w:val="17"/>
                 <w:szCs w:val="17"/>
               </w:rPr>
-              <w:t xml:space="preserve">() </w:t>
+              <w:t>(</w:t>
+            </w:r>
+            <w:proofErr w:type="gramEnd"/>
+            <w:r>
+              <w:rPr>
+                <w:color w:val="FFFFFF"/>
+                <w:sz w:val="17"/>
+                <w:szCs w:val="17"/>
+              </w:rPr>
+              <w:t xml:space="preserve">) </w:t>
             </w:r>
             <w:proofErr w:type="spellStart"/>
             <w:r>
@@ -17245,6 +17969,7 @@
       <w:pPr>
         <w:spacing w:before="280" w:after="80"/>
       </w:pPr>
+      <w:proofErr w:type="gramStart"/>
       <w:r>
         <w:rPr>
           <w:b/>
@@ -17253,9 +17978,9 @@
           <w:sz w:val="22"/>
           <w:szCs w:val="22"/>
         </w:rPr>
-        <w:t xml:space="preserve">C.1  Dua </w:t>
-      </w:r>
-      <w:proofErr w:type="spellStart"/>
+        <w:t>C.1  Dua</w:t>
+      </w:r>
+      <w:proofErr w:type="gramEnd"/>
       <w:r>
         <w:rPr>
           <w:b/>
@@ -17264,6 +17989,17 @@
           <w:sz w:val="22"/>
           <w:szCs w:val="22"/>
         </w:rPr>
+        <w:t xml:space="preserve"> </w:t>
+      </w:r>
+      <w:proofErr w:type="spellStart"/>
+      <w:r>
+        <w:rPr>
+          <w:b/>
+          <w:bCs/>
+          <w:color w:val="003796"/>
+          <w:sz w:val="22"/>
+          <w:szCs w:val="22"/>
+        </w:rPr>
         <w:t>arah</w:t>
       </w:r>
       <w:proofErr w:type="spellEnd"/>
@@ -17307,6 +18043,7 @@
         <w:t xml:space="preserve"> </w:t>
       </w:r>
       <w:proofErr w:type="spellStart"/>
+      <w:proofErr w:type="gramStart"/>
       <w:r>
         <w:rPr>
           <w:color w:val="1A1A2E"/>
@@ -17318,7 +18055,14 @@
         <w:rPr>
           <w:color w:val="1A1A2E"/>
         </w:rPr>
-        <w:t xml:space="preserve">(), dan </w:t>
+        <w:t>(</w:t>
+      </w:r>
+      <w:proofErr w:type="gramEnd"/>
+      <w:r>
+        <w:rPr>
+          <w:color w:val="1A1A2E"/>
+        </w:rPr>
+        <w:t xml:space="preserve">), dan </w:t>
       </w:r>
       <w:proofErr w:type="spellStart"/>
       <w:r>
@@ -17597,6 +18341,7 @@
               <w:t xml:space="preserve">const data = await </w:t>
             </w:r>
             <w:proofErr w:type="spellStart"/>
+            <w:proofErr w:type="gramStart"/>
             <w:r>
               <w:rPr>
                 <w:rFonts w:ascii="Verdana" w:eastAsia="Verdana" w:hAnsi="Verdana" w:cs="Verdana"/>
@@ -17607,6 +18352,7 @@
               <w:t>respons.json</w:t>
             </w:r>
             <w:proofErr w:type="spellEnd"/>
+            <w:proofErr w:type="gramEnd"/>
             <w:r>
               <w:rPr>
                 <w:rFonts w:ascii="Verdana" w:eastAsia="Verdana" w:hAnsi="Verdana" w:cs="Verdana"/>
@@ -17631,6 +18377,7 @@
               <w:t>console.log(</w:t>
             </w:r>
             <w:proofErr w:type="spellStart"/>
+            <w:proofErr w:type="gramStart"/>
             <w:r>
               <w:rPr>
                 <w:rFonts w:ascii="Verdana" w:eastAsia="Verdana" w:hAnsi="Verdana" w:cs="Verdana"/>
@@ -17641,6 +18388,7 @@
               <w:t>data.titulu</w:t>
             </w:r>
             <w:proofErr w:type="spellEnd"/>
+            <w:proofErr w:type="gramEnd"/>
             <w:r>
               <w:rPr>
                 <w:rFonts w:ascii="Verdana" w:eastAsia="Verdana" w:hAnsi="Verdana" w:cs="Verdana"/>
@@ -17745,6 +18493,7 @@
               <w:t>JSON.stringify</w:t>
             </w:r>
             <w:proofErr w:type="spellEnd"/>
+            <w:proofErr w:type="gramStart"/>
             <w:r>
               <w:rPr>
                 <w:rFonts w:ascii="Verdana" w:eastAsia="Verdana" w:hAnsi="Verdana" w:cs="Verdana"/>
@@ -17765,6 +18514,7 @@
               <w:t>titulu</w:t>
             </w:r>
             <w:proofErr w:type="spellEnd"/>
+            <w:proofErr w:type="gramEnd"/>
             <w:r>
               <w:rPr>
                 <w:rFonts w:ascii="Verdana" w:eastAsia="Verdana" w:hAnsi="Verdana" w:cs="Verdana"/>
@@ -17812,13 +18562,9 @@
                 <w:sz w:val="17"/>
                 <w:szCs w:val="17"/>
               </w:rPr>
-              <w:t>: 2 });</w:t>
-            </w:r>
-          </w:p>
-          <w:p>
-            <w:pPr>
-              <w:spacing w:after="0"/>
-            </w:pPr>
+              <w:t xml:space="preserve">: </w:t>
+            </w:r>
+            <w:proofErr w:type="gramStart"/>
             <w:r>
               <w:rPr>
                 <w:rFonts w:ascii="Verdana" w:eastAsia="Verdana" w:hAnsi="Verdana" w:cs="Verdana"/>
@@ -17826,9 +18572,9 @@
                 <w:sz w:val="17"/>
                 <w:szCs w:val="17"/>
               </w:rPr>
-              <w:t>console.log(</w:t>
-            </w:r>
-            <w:proofErr w:type="spellStart"/>
+              <w:t>2 }</w:t>
+            </w:r>
+            <w:proofErr w:type="gramEnd"/>
             <w:r>
               <w:rPr>
                 <w:rFonts w:ascii="Verdana" w:eastAsia="Verdana" w:hAnsi="Verdana" w:cs="Verdana"/>
@@ -17836,9 +18582,14 @@
                 <w:sz w:val="17"/>
                 <w:szCs w:val="17"/>
               </w:rPr>
-              <w:t>typeof</w:t>
-            </w:r>
-            <w:proofErr w:type="spellEnd"/>
+              <w:t>);</w:t>
+            </w:r>
+          </w:p>
+          <w:p>
+            <w:pPr>
+              <w:spacing w:after="0"/>
+            </w:pPr>
+            <w:proofErr w:type="gramStart"/>
             <w:r>
               <w:rPr>
                 <w:rFonts w:ascii="Verdana" w:eastAsia="Verdana" w:hAnsi="Verdana" w:cs="Verdana"/>
@@ -17846,7 +18597,48 @@
                 <w:sz w:val="17"/>
                 <w:szCs w:val="17"/>
               </w:rPr>
-              <w:t xml:space="preserve"> badan);   // string</w:t>
+              <w:t>console.log(</w:t>
+            </w:r>
+            <w:proofErr w:type="spellStart"/>
+            <w:r>
+              <w:rPr>
+                <w:rFonts w:ascii="Verdana" w:eastAsia="Verdana" w:hAnsi="Verdana" w:cs="Verdana"/>
+                <w:color w:val="1F2A44"/>
+                <w:sz w:val="17"/>
+                <w:szCs w:val="17"/>
+              </w:rPr>
+              <w:t>typeof</w:t>
+            </w:r>
+            <w:proofErr w:type="spellEnd"/>
+            <w:proofErr w:type="gramEnd"/>
+            <w:r>
+              <w:rPr>
+                <w:rFonts w:ascii="Verdana" w:eastAsia="Verdana" w:hAnsi="Verdana" w:cs="Verdana"/>
+                <w:color w:val="1F2A44"/>
+                <w:sz w:val="17"/>
+                <w:szCs w:val="17"/>
+              </w:rPr>
+              <w:t xml:space="preserve"> badan</w:t>
+            </w:r>
+            <w:proofErr w:type="gramStart"/>
+            <w:r>
+              <w:rPr>
+                <w:rFonts w:ascii="Verdana" w:eastAsia="Verdana" w:hAnsi="Verdana" w:cs="Verdana"/>
+                <w:color w:val="1F2A44"/>
+                <w:sz w:val="17"/>
+                <w:szCs w:val="17"/>
+              </w:rPr>
+              <w:t xml:space="preserve">);   </w:t>
+            </w:r>
+            <w:proofErr w:type="gramEnd"/>
+            <w:r>
+              <w:rPr>
+                <w:rFonts w:ascii="Verdana" w:eastAsia="Verdana" w:hAnsi="Verdana" w:cs="Verdana"/>
+                <w:color w:val="1F2A44"/>
+                <w:sz w:val="17"/>
+                <w:szCs w:val="17"/>
+              </w:rPr>
+              <w:t>// string</w:t>
             </w:r>
           </w:p>
         </w:tc>
@@ -18011,6 +18803,7 @@
               <w:spacing w:after="0"/>
             </w:pPr>
             <w:proofErr w:type="spellStart"/>
+            <w:proofErr w:type="gramStart"/>
             <w:r>
               <w:rPr>
                 <w:color w:val="1A1A2E"/>
@@ -18020,6 +18813,7 @@
               <w:t>respons.json</w:t>
             </w:r>
             <w:proofErr w:type="spellEnd"/>
+            <w:proofErr w:type="gramEnd"/>
             <w:r>
               <w:rPr>
                 <w:color w:val="1A1A2E"/>
@@ -18775,6 +19569,7 @@
       <w:pPr>
         <w:spacing w:before="280" w:after="80"/>
       </w:pPr>
+      <w:proofErr w:type="gramStart"/>
       <w:r>
         <w:rPr>
           <w:b/>
@@ -18783,7 +19578,18 @@
           <w:sz w:val="22"/>
           <w:szCs w:val="22"/>
         </w:rPr>
-        <w:t xml:space="preserve">C.2  Peta data </w:t>
+        <w:t>C.2  Peta</w:t>
+      </w:r>
+      <w:proofErr w:type="gramEnd"/>
+      <w:r>
+        <w:rPr>
+          <w:b/>
+          <w:bCs/>
+          <w:color w:val="003796"/>
+          <w:sz w:val="22"/>
+          <w:szCs w:val="22"/>
+        </w:rPr>
+        <w:t xml:space="preserve"> data </w:t>
       </w:r>
       <w:proofErr w:type="spellStart"/>
       <w:r>
@@ -19240,13 +20046,23 @@
             <w:pPr>
               <w:spacing w:after="0"/>
             </w:pPr>
-            <w:r>
-              <w:rPr>
-                <w:color w:val="1A1A2E"/>
-                <w:sz w:val="18"/>
-                <w:szCs w:val="18"/>
-              </w:rPr>
-              <w:t>data.____</w:t>
+            <w:proofErr w:type="gramStart"/>
+            <w:r>
+              <w:rPr>
+                <w:color w:val="1A1A2E"/>
+                <w:sz w:val="18"/>
+                <w:szCs w:val="18"/>
+              </w:rPr>
+              <w:t>data._</w:t>
+            </w:r>
+            <w:proofErr w:type="gramEnd"/>
+            <w:r>
+              <w:rPr>
+                <w:color w:val="1A1A2E"/>
+                <w:sz w:val="18"/>
+                <w:szCs w:val="18"/>
+              </w:rPr>
+              <w:t>___</w:t>
             </w:r>
           </w:p>
         </w:tc>
@@ -19294,13 +20110,32 @@
             <w:pPr>
               <w:spacing w:after="0"/>
             </w:pPr>
-            <w:r>
-              <w:rPr>
-                <w:color w:val="1A1A2E"/>
-                <w:sz w:val="18"/>
-                <w:szCs w:val="18"/>
-              </w:rPr>
-              <w:t>data.____.</w:t>
+            <w:proofErr w:type="gramStart"/>
+            <w:r>
+              <w:rPr>
+                <w:color w:val="1A1A2E"/>
+                <w:sz w:val="18"/>
+                <w:szCs w:val="18"/>
+              </w:rPr>
+              <w:t>data._</w:t>
+            </w:r>
+            <w:proofErr w:type="gramEnd"/>
+            <w:r>
+              <w:rPr>
+                <w:color w:val="1A1A2E"/>
+                <w:sz w:val="18"/>
+                <w:szCs w:val="18"/>
+              </w:rPr>
+              <w:t>__</w:t>
+            </w:r>
+            <w:proofErr w:type="gramStart"/>
+            <w:r>
+              <w:rPr>
+                <w:color w:val="1A1A2E"/>
+                <w:sz w:val="18"/>
+                <w:szCs w:val="18"/>
+              </w:rPr>
+              <w:t>_.</w:t>
             </w:r>
             <w:proofErr w:type="spellStart"/>
             <w:r>
@@ -19312,6 +20147,7 @@
               <w:t>forEach</w:t>
             </w:r>
             <w:proofErr w:type="spellEnd"/>
+            <w:proofErr w:type="gramEnd"/>
             <w:r>
               <w:rPr>
                 <w:color w:val="1A1A2E"/>
@@ -19402,13 +20238,23 @@
             <w:pPr>
               <w:spacing w:after="0"/>
             </w:pPr>
-            <w:r>
-              <w:rPr>
-                <w:color w:val="1A1A2E"/>
-                <w:sz w:val="18"/>
-                <w:szCs w:val="18"/>
-              </w:rPr>
-              <w:t>data.____</w:t>
+            <w:proofErr w:type="gramStart"/>
+            <w:r>
+              <w:rPr>
+                <w:color w:val="1A1A2E"/>
+                <w:sz w:val="18"/>
+                <w:szCs w:val="18"/>
+              </w:rPr>
+              <w:t>data._</w:t>
+            </w:r>
+            <w:proofErr w:type="gramEnd"/>
+            <w:r>
+              <w:rPr>
+                <w:color w:val="1A1A2E"/>
+                <w:sz w:val="18"/>
+                <w:szCs w:val="18"/>
+              </w:rPr>
+              <w:t>___</w:t>
             </w:r>
           </w:p>
         </w:tc>
@@ -19500,13 +20346,23 @@
             <w:pPr>
               <w:spacing w:after="0"/>
             </w:pPr>
-            <w:r>
-              <w:rPr>
-                <w:color w:val="1A1A2E"/>
-                <w:sz w:val="18"/>
-                <w:szCs w:val="18"/>
-              </w:rPr>
-              <w:t>data.____</w:t>
+            <w:proofErr w:type="gramStart"/>
+            <w:r>
+              <w:rPr>
+                <w:color w:val="1A1A2E"/>
+                <w:sz w:val="18"/>
+                <w:szCs w:val="18"/>
+              </w:rPr>
+              <w:t>data._</w:t>
+            </w:r>
+            <w:proofErr w:type="gramEnd"/>
+            <w:r>
+              <w:rPr>
+                <w:color w:val="1A1A2E"/>
+                <w:sz w:val="18"/>
+                <w:szCs w:val="18"/>
+              </w:rPr>
+              <w:t>___</w:t>
             </w:r>
           </w:p>
         </w:tc>
@@ -19521,6 +20377,7 @@
       <w:pPr>
         <w:spacing w:before="280" w:after="80"/>
       </w:pPr>
+      <w:proofErr w:type="gramStart"/>
       <w:r>
         <w:rPr>
           <w:b/>
@@ -19543,6 +20400,7 @@
         <w:t>Periksa</w:t>
       </w:r>
       <w:proofErr w:type="spellEnd"/>
+      <w:proofErr w:type="gramEnd"/>
       <w:r>
         <w:rPr>
           <w:b/>
@@ -20027,6 +20885,7 @@
             <w:pPr>
               <w:spacing w:after="0"/>
             </w:pPr>
+            <w:proofErr w:type="gramStart"/>
             <w:r>
               <w:rPr>
                 <w:b/>
@@ -20039,7 +20898,14 @@
               <w:rPr>
                 <w:color w:val="FFFFFF"/>
               </w:rPr>
-              <w:t>SIMPAN KE GIT - SETELAH LEMBAR C</w:t>
+              <w:t>SIMPAN</w:t>
+            </w:r>
+            <w:proofErr w:type="gramEnd"/>
+            <w:r>
+              <w:rPr>
+                <w:color w:val="FFFFFF"/>
+              </w:rPr>
+              <w:t xml:space="preserve"> KE GIT - SETELAH LEMBAR C</w:t>
             </w:r>
           </w:p>
         </w:tc>
@@ -20090,8 +20956,19 @@
                 <w:sz w:val="17"/>
                 <w:szCs w:val="17"/>
               </w:rPr>
-              <w:t>git add .</w:t>
-            </w:r>
+              <w:t xml:space="preserve">git </w:t>
+            </w:r>
+            <w:proofErr w:type="gramStart"/>
+            <w:r>
+              <w:rPr>
+                <w:rFonts w:ascii="Verdana" w:eastAsia="Verdana" w:hAnsi="Verdana" w:cs="Verdana"/>
+                <w:color w:val="1F2A44"/>
+                <w:sz w:val="17"/>
+                <w:szCs w:val="17"/>
+              </w:rPr>
+              <w:t>add .</w:t>
+            </w:r>
+            <w:proofErr w:type="gramEnd"/>
           </w:p>
           <w:p>
             <w:pPr>
@@ -21114,13 +21991,23 @@
             <w:pPr>
               <w:spacing w:after="0"/>
             </w:pPr>
+            <w:proofErr w:type="gramStart"/>
             <w:r>
               <w:rPr>
                 <w:color w:val="FFFFFF"/>
                 <w:sz w:val="17"/>
                 <w:szCs w:val="17"/>
               </w:rPr>
-              <w:t>▌  PISAHKAN PENGAMBILAN DATA DARI PENGGAMBARAN</w:t>
+              <w:t>▌  PISAHKAN</w:t>
+            </w:r>
+            <w:proofErr w:type="gramEnd"/>
+            <w:r>
+              <w:rPr>
+                <w:color w:val="FFFFFF"/>
+                <w:sz w:val="17"/>
+                <w:szCs w:val="17"/>
+              </w:rPr>
+              <w:t xml:space="preserve"> PENGAMBILAN DATA DARI PENGGAMBARAN</w:t>
             </w:r>
           </w:p>
           <w:p>
@@ -21608,6 +22495,7 @@
       <w:pPr>
         <w:spacing w:before="280" w:after="80"/>
       </w:pPr>
+      <w:proofErr w:type="gramStart"/>
       <w:r>
         <w:rPr>
           <w:b/>
@@ -21630,6 +22518,7 @@
         <w:t>Telusuri</w:t>
       </w:r>
       <w:proofErr w:type="spellEnd"/>
+      <w:proofErr w:type="gramEnd"/>
       <w:r>
         <w:rPr>
           <w:b/>
@@ -22064,9 +22953,9 @@
                 <w:sz w:val="17"/>
                 <w:szCs w:val="17"/>
               </w:rPr>
-              <w:t xml:space="preserve">import { </w:t>
-            </w:r>
-            <w:proofErr w:type="spellStart"/>
+              <w:t xml:space="preserve">import </w:t>
+            </w:r>
+            <w:proofErr w:type="gramStart"/>
             <w:r>
               <w:rPr>
                 <w:rFonts w:ascii="Verdana" w:eastAsia="Verdana" w:hAnsi="Verdana" w:cs="Verdana"/>
@@ -22074,9 +22963,9 @@
                 <w:sz w:val="17"/>
                 <w:szCs w:val="17"/>
               </w:rPr>
-              <w:t>ambilNotisia</w:t>
-            </w:r>
-            <w:proofErr w:type="spellEnd"/>
+              <w:t xml:space="preserve">{ </w:t>
+            </w:r>
+            <w:proofErr w:type="spellStart"/>
             <w:r>
               <w:rPr>
                 <w:rFonts w:ascii="Verdana" w:eastAsia="Verdana" w:hAnsi="Verdana" w:cs="Verdana"/>
@@ -22084,18 +22973,10 @@
                 <w:sz w:val="17"/>
                 <w:szCs w:val="17"/>
               </w:rPr>
-              <w:t xml:space="preserve"> } from './api.js';</w:t>
-            </w:r>
-          </w:p>
-          <w:p>
-            <w:pPr>
-              <w:spacing w:after="0"/>
-            </w:pPr>
-          </w:p>
-          <w:p>
-            <w:pPr>
-              <w:spacing w:after="0"/>
-            </w:pPr>
+              <w:t>ambilNotisia</w:t>
+            </w:r>
+            <w:proofErr w:type="spellEnd"/>
+            <w:proofErr w:type="gramEnd"/>
             <w:r>
               <w:rPr>
                 <w:rFonts w:ascii="Verdana" w:eastAsia="Verdana" w:hAnsi="Verdana" w:cs="Verdana"/>
@@ -22103,9 +22984,18 @@
                 <w:sz w:val="17"/>
                 <w:szCs w:val="17"/>
               </w:rPr>
-              <w:t xml:space="preserve">const </w:t>
-            </w:r>
-            <w:proofErr w:type="spellStart"/>
+              <w:t xml:space="preserve"> } from './api.js';</w:t>
+            </w:r>
+          </w:p>
+          <w:p>
+            <w:pPr>
+              <w:spacing w:after="0"/>
+            </w:pPr>
+          </w:p>
+          <w:p>
+            <w:pPr>
+              <w:spacing w:after="0"/>
+            </w:pPr>
             <w:r>
               <w:rPr>
                 <w:rFonts w:ascii="Verdana" w:eastAsia="Verdana" w:hAnsi="Verdana" w:cs="Verdana"/>
@@ -22113,9 +23003,9 @@
                 <w:sz w:val="17"/>
                 <w:szCs w:val="17"/>
               </w:rPr>
-              <w:t>wadah</w:t>
-            </w:r>
-            <w:proofErr w:type="spellEnd"/>
+              <w:t xml:space="preserve">const </w:t>
+            </w:r>
+            <w:proofErr w:type="spellStart"/>
             <w:r>
               <w:rPr>
                 <w:rFonts w:ascii="Verdana" w:eastAsia="Verdana" w:hAnsi="Verdana" w:cs="Verdana"/>
@@ -22123,9 +23013,9 @@
                 <w:sz w:val="17"/>
                 <w:szCs w:val="17"/>
               </w:rPr>
-              <w:t xml:space="preserve"> = </w:t>
-            </w:r>
-            <w:proofErr w:type="spellStart"/>
+              <w:t>wadah</w:t>
+            </w:r>
+            <w:proofErr w:type="spellEnd"/>
             <w:r>
               <w:rPr>
                 <w:rFonts w:ascii="Verdana" w:eastAsia="Verdana" w:hAnsi="Verdana" w:cs="Verdana"/>
@@ -22133,9 +23023,10 @@
                 <w:sz w:val="17"/>
                 <w:szCs w:val="17"/>
               </w:rPr>
-              <w:t>document.querySelector</w:t>
-            </w:r>
-            <w:proofErr w:type="spellEnd"/>
+              <w:t xml:space="preserve"> = </w:t>
+            </w:r>
+            <w:proofErr w:type="spellStart"/>
+            <w:proofErr w:type="gramStart"/>
             <w:r>
               <w:rPr>
                 <w:rFonts w:ascii="Verdana" w:eastAsia="Verdana" w:hAnsi="Verdana" w:cs="Verdana"/>
@@ -22143,18 +23034,9 @@
                 <w:sz w:val="17"/>
                 <w:szCs w:val="17"/>
               </w:rPr>
-              <w:t>('#daftar');</w:t>
-            </w:r>
-          </w:p>
-          <w:p>
-            <w:pPr>
-              <w:spacing w:after="0"/>
-            </w:pPr>
-          </w:p>
-          <w:p>
-            <w:pPr>
-              <w:spacing w:after="0"/>
-            </w:pPr>
+              <w:t>document.querySelector</w:t>
+            </w:r>
+            <w:proofErr w:type="spellEnd"/>
             <w:r>
               <w:rPr>
                 <w:rFonts w:ascii="Verdana" w:eastAsia="Verdana" w:hAnsi="Verdana" w:cs="Verdana"/>
@@ -22162,9 +23044,9 @@
                 <w:sz w:val="17"/>
                 <w:szCs w:val="17"/>
               </w:rPr>
-              <w:t xml:space="preserve">function </w:t>
-            </w:r>
-            <w:proofErr w:type="spellStart"/>
+              <w:t>('#</w:t>
+            </w:r>
+            <w:proofErr w:type="gramEnd"/>
             <w:r>
               <w:rPr>
                 <w:rFonts w:ascii="Verdana" w:eastAsia="Verdana" w:hAnsi="Verdana" w:cs="Verdana"/>
@@ -22172,9 +23054,18 @@
                 <w:sz w:val="17"/>
                 <w:szCs w:val="17"/>
               </w:rPr>
-              <w:t>gambar</w:t>
-            </w:r>
-            <w:proofErr w:type="spellEnd"/>
+              <w:t>daftar');</w:t>
+            </w:r>
+          </w:p>
+          <w:p>
+            <w:pPr>
+              <w:spacing w:after="0"/>
+            </w:pPr>
+          </w:p>
+          <w:p>
+            <w:pPr>
+              <w:spacing w:after="0"/>
+            </w:pPr>
             <w:r>
               <w:rPr>
                 <w:rFonts w:ascii="Verdana" w:eastAsia="Verdana" w:hAnsi="Verdana" w:cs="Verdana"/>
@@ -22182,13 +23073,9 @@
                 <w:sz w:val="17"/>
                 <w:szCs w:val="17"/>
               </w:rPr>
-              <w:t>(daftar) {</w:t>
-            </w:r>
-          </w:p>
-          <w:p>
-            <w:pPr>
-              <w:spacing w:after="0"/>
-            </w:pPr>
+              <w:t xml:space="preserve">function </w:t>
+            </w:r>
+            <w:proofErr w:type="spellStart"/>
             <w:r>
               <w:rPr>
                 <w:rFonts w:ascii="Verdana" w:eastAsia="Verdana" w:hAnsi="Verdana" w:cs="Verdana"/>
@@ -22196,9 +23083,9 @@
                 <w:sz w:val="17"/>
                 <w:szCs w:val="17"/>
               </w:rPr>
-              <w:t xml:space="preserve">  </w:t>
-            </w:r>
-            <w:proofErr w:type="spellStart"/>
+              <w:t>gambar</w:t>
+            </w:r>
+            <w:proofErr w:type="spellEnd"/>
             <w:r>
               <w:rPr>
                 <w:rFonts w:ascii="Verdana" w:eastAsia="Verdana" w:hAnsi="Verdana" w:cs="Verdana"/>
@@ -22206,9 +23093,9 @@
                 <w:sz w:val="17"/>
                 <w:szCs w:val="17"/>
               </w:rPr>
-              <w:t>wadah.textContent</w:t>
-            </w:r>
-            <w:proofErr w:type="spellEnd"/>
+              <w:t>(daftar</w:t>
+            </w:r>
+            <w:proofErr w:type="gramStart"/>
             <w:r>
               <w:rPr>
                 <w:rFonts w:ascii="Verdana" w:eastAsia="Verdana" w:hAnsi="Verdana" w:cs="Verdana"/>
@@ -22216,8 +23103,9 @@
                 <w:sz w:val="17"/>
                 <w:szCs w:val="17"/>
               </w:rPr>
-              <w:t xml:space="preserve"> = '';</w:t>
-            </w:r>
+              <w:t>) {</w:t>
+            </w:r>
+            <w:proofErr w:type="gramEnd"/>
           </w:p>
           <w:p>
             <w:pPr>
@@ -22233,6 +23121,7 @@
               <w:t xml:space="preserve">  </w:t>
             </w:r>
             <w:proofErr w:type="spellStart"/>
+            <w:proofErr w:type="gramStart"/>
             <w:r>
               <w:rPr>
                 <w:rFonts w:ascii="Verdana" w:eastAsia="Verdana" w:hAnsi="Verdana" w:cs="Verdana"/>
@@ -22240,9 +23129,10 @@
                 <w:sz w:val="17"/>
                 <w:szCs w:val="17"/>
               </w:rPr>
-              <w:t>daftar.forEach</w:t>
-            </w:r>
-            <w:proofErr w:type="spellEnd"/>
+              <w:t>wadah.textContent</w:t>
+            </w:r>
+            <w:proofErr w:type="spellEnd"/>
+            <w:proofErr w:type="gramEnd"/>
             <w:r>
               <w:rPr>
                 <w:rFonts w:ascii="Verdana" w:eastAsia="Verdana" w:hAnsi="Verdana" w:cs="Verdana"/>
@@ -22250,13 +23140,9 @@
                 <w:sz w:val="17"/>
                 <w:szCs w:val="17"/>
               </w:rPr>
-              <w:t>(function (n) {</w:t>
-            </w:r>
-          </w:p>
-          <w:p>
-            <w:pPr>
-              <w:spacing w:after="0"/>
-            </w:pPr>
+              <w:t xml:space="preserve"> </w:t>
+            </w:r>
+            <w:proofErr w:type="gramStart"/>
             <w:r>
               <w:rPr>
                 <w:rFonts w:ascii="Verdana" w:eastAsia="Verdana" w:hAnsi="Verdana" w:cs="Verdana"/>
@@ -22264,9 +23150,9 @@
                 <w:sz w:val="17"/>
                 <w:szCs w:val="17"/>
               </w:rPr>
-              <w:t xml:space="preserve">    const </w:t>
-            </w:r>
-            <w:proofErr w:type="spellStart"/>
+              <w:t>= ''</w:t>
+            </w:r>
+            <w:proofErr w:type="gramEnd"/>
             <w:r>
               <w:rPr>
                 <w:rFonts w:ascii="Verdana" w:eastAsia="Verdana" w:hAnsi="Verdana" w:cs="Verdana"/>
@@ -22274,9 +23160,13 @@
                 <w:sz w:val="17"/>
                 <w:szCs w:val="17"/>
               </w:rPr>
-              <w:t>kartu</w:t>
-            </w:r>
-            <w:proofErr w:type="spellEnd"/>
+              <w:t>;</w:t>
+            </w:r>
+          </w:p>
+          <w:p>
+            <w:pPr>
+              <w:spacing w:after="0"/>
+            </w:pPr>
             <w:r>
               <w:rPr>
                 <w:rFonts w:ascii="Verdana" w:eastAsia="Verdana" w:hAnsi="Verdana" w:cs="Verdana"/>
@@ -22284,9 +23174,10 @@
                 <w:sz w:val="17"/>
                 <w:szCs w:val="17"/>
               </w:rPr>
-              <w:t xml:space="preserve"> = </w:t>
-            </w:r>
-            <w:proofErr w:type="spellStart"/>
+              <w:t xml:space="preserve">  </w:t>
+            </w:r>
+            <w:proofErr w:type="spellStart"/>
+            <w:proofErr w:type="gramStart"/>
             <w:r>
               <w:rPr>
                 <w:rFonts w:ascii="Verdana" w:eastAsia="Verdana" w:hAnsi="Verdana" w:cs="Verdana"/>
@@ -22294,9 +23185,10 @@
                 <w:sz w:val="17"/>
                 <w:szCs w:val="17"/>
               </w:rPr>
-              <w:t>document.createElement</w:t>
-            </w:r>
-            <w:proofErr w:type="spellEnd"/>
+              <w:t>daftar.forEach</w:t>
+            </w:r>
+            <w:proofErr w:type="spellEnd"/>
+            <w:proofErr w:type="gramEnd"/>
             <w:r>
               <w:rPr>
                 <w:rFonts w:ascii="Verdana" w:eastAsia="Verdana" w:hAnsi="Verdana" w:cs="Verdana"/>
@@ -22304,13 +23196,9 @@
                 <w:sz w:val="17"/>
                 <w:szCs w:val="17"/>
               </w:rPr>
-              <w:t>('article');</w:t>
-            </w:r>
-          </w:p>
-          <w:p>
-            <w:pPr>
-              <w:spacing w:after="0"/>
-            </w:pPr>
+              <w:t>(function (</w:t>
+            </w:r>
+            <w:proofErr w:type="gramStart"/>
             <w:r>
               <w:rPr>
                 <w:rFonts w:ascii="Verdana" w:eastAsia="Verdana" w:hAnsi="Verdana" w:cs="Verdana"/>
@@ -22318,9 +23206,14 @@
                 <w:sz w:val="17"/>
                 <w:szCs w:val="17"/>
               </w:rPr>
-              <w:t xml:space="preserve">    const </w:t>
-            </w:r>
-            <w:proofErr w:type="spellStart"/>
+              <w:t>n) {</w:t>
+            </w:r>
+            <w:proofErr w:type="gramEnd"/>
+          </w:p>
+          <w:p>
+            <w:pPr>
+              <w:spacing w:after="0"/>
+            </w:pPr>
             <w:r>
               <w:rPr>
                 <w:rFonts w:ascii="Verdana" w:eastAsia="Verdana" w:hAnsi="Verdana" w:cs="Verdana"/>
@@ -22328,9 +23221,9 @@
                 <w:sz w:val="17"/>
                 <w:szCs w:val="17"/>
               </w:rPr>
-              <w:t>judul</w:t>
-            </w:r>
-            <w:proofErr w:type="spellEnd"/>
+              <w:t xml:space="preserve">    const </w:t>
+            </w:r>
+            <w:proofErr w:type="spellStart"/>
             <w:r>
               <w:rPr>
                 <w:rFonts w:ascii="Verdana" w:eastAsia="Verdana" w:hAnsi="Verdana" w:cs="Verdana"/>
@@ -22338,9 +23231,9 @@
                 <w:sz w:val="17"/>
                 <w:szCs w:val="17"/>
               </w:rPr>
-              <w:t xml:space="preserve"> = </w:t>
-            </w:r>
-            <w:proofErr w:type="spellStart"/>
+              <w:t>kartu</w:t>
+            </w:r>
+            <w:proofErr w:type="spellEnd"/>
             <w:r>
               <w:rPr>
                 <w:rFonts w:ascii="Verdana" w:eastAsia="Verdana" w:hAnsi="Verdana" w:cs="Verdana"/>
@@ -22348,9 +23241,10 @@
                 <w:sz w:val="17"/>
                 <w:szCs w:val="17"/>
               </w:rPr>
-              <w:t>document.createElement</w:t>
-            </w:r>
-            <w:proofErr w:type="spellEnd"/>
+              <w:t xml:space="preserve"> = </w:t>
+            </w:r>
+            <w:proofErr w:type="spellStart"/>
+            <w:proofErr w:type="gramStart"/>
             <w:r>
               <w:rPr>
                 <w:rFonts w:ascii="Verdana" w:eastAsia="Verdana" w:hAnsi="Verdana" w:cs="Verdana"/>
@@ -22358,13 +23252,10 @@
                 <w:sz w:val="17"/>
                 <w:szCs w:val="17"/>
               </w:rPr>
-              <w:t>('h3');</w:t>
-            </w:r>
-          </w:p>
-          <w:p>
-            <w:pPr>
-              <w:spacing w:after="0"/>
-            </w:pPr>
+              <w:t>document.createElement</w:t>
+            </w:r>
+            <w:proofErr w:type="spellEnd"/>
+            <w:proofErr w:type="gramEnd"/>
             <w:r>
               <w:rPr>
                 <w:rFonts w:ascii="Verdana" w:eastAsia="Verdana" w:hAnsi="Verdana" w:cs="Verdana"/>
@@ -22372,9 +23263,13 @@
                 <w:sz w:val="17"/>
                 <w:szCs w:val="17"/>
               </w:rPr>
-              <w:t xml:space="preserve">    </w:t>
-            </w:r>
-            <w:proofErr w:type="spellStart"/>
+              <w:t>('article');</w:t>
+            </w:r>
+          </w:p>
+          <w:p>
+            <w:pPr>
+              <w:spacing w:after="0"/>
+            </w:pPr>
             <w:r>
               <w:rPr>
                 <w:rFonts w:ascii="Verdana" w:eastAsia="Verdana" w:hAnsi="Verdana" w:cs="Verdana"/>
@@ -22382,9 +23277,9 @@
                 <w:sz w:val="17"/>
                 <w:szCs w:val="17"/>
               </w:rPr>
-              <w:t>judul.textContent</w:t>
-            </w:r>
-            <w:proofErr w:type="spellEnd"/>
+              <w:t xml:space="preserve">    const </w:t>
+            </w:r>
+            <w:proofErr w:type="spellStart"/>
             <w:r>
               <w:rPr>
                 <w:rFonts w:ascii="Verdana" w:eastAsia="Verdana" w:hAnsi="Verdana" w:cs="Verdana"/>
@@ -22392,9 +23287,9 @@
                 <w:sz w:val="17"/>
                 <w:szCs w:val="17"/>
               </w:rPr>
-              <w:t xml:space="preserve"> = </w:t>
-            </w:r>
-            <w:proofErr w:type="spellStart"/>
+              <w:t>judul</w:t>
+            </w:r>
+            <w:proofErr w:type="spellEnd"/>
             <w:r>
               <w:rPr>
                 <w:rFonts w:ascii="Verdana" w:eastAsia="Verdana" w:hAnsi="Verdana" w:cs="Verdana"/>
@@ -22402,9 +23297,10 @@
                 <w:sz w:val="17"/>
                 <w:szCs w:val="17"/>
               </w:rPr>
-              <w:t>n.titulu</w:t>
-            </w:r>
-            <w:proofErr w:type="spellEnd"/>
+              <w:t xml:space="preserve"> = </w:t>
+            </w:r>
+            <w:proofErr w:type="spellStart"/>
+            <w:proofErr w:type="gramStart"/>
             <w:r>
               <w:rPr>
                 <w:rFonts w:ascii="Verdana" w:eastAsia="Verdana" w:hAnsi="Verdana" w:cs="Verdana"/>
@@ -22412,13 +23308,10 @@
                 <w:sz w:val="17"/>
                 <w:szCs w:val="17"/>
               </w:rPr>
-              <w:t>;</w:t>
-            </w:r>
-          </w:p>
-          <w:p>
-            <w:pPr>
-              <w:spacing w:after="0"/>
-            </w:pPr>
+              <w:t>document.createElement</w:t>
+            </w:r>
+            <w:proofErr w:type="spellEnd"/>
+            <w:proofErr w:type="gramEnd"/>
             <w:r>
               <w:rPr>
                 <w:rFonts w:ascii="Verdana" w:eastAsia="Verdana" w:hAnsi="Verdana" w:cs="Verdana"/>
@@ -22426,9 +23319,13 @@
                 <w:sz w:val="17"/>
                 <w:szCs w:val="17"/>
               </w:rPr>
-              <w:t xml:space="preserve">    </w:t>
-            </w:r>
-            <w:proofErr w:type="spellStart"/>
+              <w:t>('h3');</w:t>
+            </w:r>
+          </w:p>
+          <w:p>
+            <w:pPr>
+              <w:spacing w:after="0"/>
+            </w:pPr>
             <w:r>
               <w:rPr>
                 <w:rFonts w:ascii="Verdana" w:eastAsia="Verdana" w:hAnsi="Verdana" w:cs="Verdana"/>
@@ -22436,9 +23333,10 @@
                 <w:sz w:val="17"/>
                 <w:szCs w:val="17"/>
               </w:rPr>
-              <w:t>kartu.appendChild</w:t>
-            </w:r>
-            <w:proofErr w:type="spellEnd"/>
+              <w:t xml:space="preserve">    </w:t>
+            </w:r>
+            <w:proofErr w:type="spellStart"/>
+            <w:proofErr w:type="gramStart"/>
             <w:r>
               <w:rPr>
                 <w:rFonts w:ascii="Verdana" w:eastAsia="Verdana" w:hAnsi="Verdana" w:cs="Verdana"/>
@@ -22446,9 +23344,10 @@
                 <w:sz w:val="17"/>
                 <w:szCs w:val="17"/>
               </w:rPr>
-              <w:t>(</w:t>
-            </w:r>
-            <w:proofErr w:type="spellStart"/>
+              <w:t>judul.textContent</w:t>
+            </w:r>
+            <w:proofErr w:type="spellEnd"/>
+            <w:proofErr w:type="gramEnd"/>
             <w:r>
               <w:rPr>
                 <w:rFonts w:ascii="Verdana" w:eastAsia="Verdana" w:hAnsi="Verdana" w:cs="Verdana"/>
@@ -22456,9 +23355,10 @@
                 <w:sz w:val="17"/>
                 <w:szCs w:val="17"/>
               </w:rPr>
-              <w:t>judul</w:t>
-            </w:r>
-            <w:proofErr w:type="spellEnd"/>
+              <w:t xml:space="preserve"> = </w:t>
+            </w:r>
+            <w:proofErr w:type="spellStart"/>
+            <w:proofErr w:type="gramStart"/>
             <w:r>
               <w:rPr>
                 <w:rFonts w:ascii="Verdana" w:eastAsia="Verdana" w:hAnsi="Verdana" w:cs="Verdana"/>
@@ -22466,13 +23366,10 @@
                 <w:sz w:val="17"/>
                 <w:szCs w:val="17"/>
               </w:rPr>
-              <w:t>);</w:t>
-            </w:r>
-          </w:p>
-          <w:p>
-            <w:pPr>
-              <w:spacing w:after="0"/>
-            </w:pPr>
+              <w:t>n.titulu</w:t>
+            </w:r>
+            <w:proofErr w:type="spellEnd"/>
+            <w:proofErr w:type="gramEnd"/>
             <w:r>
               <w:rPr>
                 <w:rFonts w:ascii="Verdana" w:eastAsia="Verdana" w:hAnsi="Verdana" w:cs="Verdana"/>
@@ -22480,9 +23377,13 @@
                 <w:sz w:val="17"/>
                 <w:szCs w:val="17"/>
               </w:rPr>
-              <w:t xml:space="preserve">    </w:t>
-            </w:r>
-            <w:proofErr w:type="spellStart"/>
+              <w:t>;</w:t>
+            </w:r>
+          </w:p>
+          <w:p>
+            <w:pPr>
+              <w:spacing w:after="0"/>
+            </w:pPr>
             <w:r>
               <w:rPr>
                 <w:rFonts w:ascii="Verdana" w:eastAsia="Verdana" w:hAnsi="Verdana" w:cs="Verdana"/>
@@ -22490,9 +23391,10 @@
                 <w:sz w:val="17"/>
                 <w:szCs w:val="17"/>
               </w:rPr>
-              <w:t>wadah.appendChild</w:t>
-            </w:r>
-            <w:proofErr w:type="spellEnd"/>
+              <w:t xml:space="preserve">    </w:t>
+            </w:r>
+            <w:proofErr w:type="spellStart"/>
+            <w:proofErr w:type="gramStart"/>
             <w:r>
               <w:rPr>
                 <w:rFonts w:ascii="Verdana" w:eastAsia="Verdana" w:hAnsi="Verdana" w:cs="Verdana"/>
@@ -22500,9 +23402,10 @@
                 <w:sz w:val="17"/>
                 <w:szCs w:val="17"/>
               </w:rPr>
-              <w:t>(</w:t>
-            </w:r>
-            <w:proofErr w:type="spellStart"/>
+              <w:t>kartu.appendChild</w:t>
+            </w:r>
+            <w:proofErr w:type="spellEnd"/>
+            <w:proofErr w:type="gramEnd"/>
             <w:r>
               <w:rPr>
                 <w:rFonts w:ascii="Verdana" w:eastAsia="Verdana" w:hAnsi="Verdana" w:cs="Verdana"/>
@@ -22510,9 +23413,9 @@
                 <w:sz w:val="17"/>
                 <w:szCs w:val="17"/>
               </w:rPr>
-              <w:t>kartu</w:t>
-            </w:r>
-            <w:proofErr w:type="spellEnd"/>
+              <w:t>(</w:t>
+            </w:r>
+            <w:proofErr w:type="spellStart"/>
             <w:r>
               <w:rPr>
                 <w:rFonts w:ascii="Verdana" w:eastAsia="Verdana" w:hAnsi="Verdana" w:cs="Verdana"/>
@@ -22520,13 +23423,9 @@
                 <w:sz w:val="17"/>
                 <w:szCs w:val="17"/>
               </w:rPr>
-              <w:t>);</w:t>
-            </w:r>
-          </w:p>
-          <w:p>
-            <w:pPr>
-              <w:spacing w:after="0"/>
-            </w:pPr>
+              <w:t>judul</w:t>
+            </w:r>
+            <w:proofErr w:type="spellEnd"/>
             <w:r>
               <w:rPr>
                 <w:rFonts w:ascii="Verdana" w:eastAsia="Verdana" w:hAnsi="Verdana" w:cs="Verdana"/>
@@ -22534,7 +23433,7 @@
                 <w:sz w:val="17"/>
                 <w:szCs w:val="17"/>
               </w:rPr>
-              <w:t xml:space="preserve">  });</w:t>
+              <w:t>);</w:t>
             </w:r>
           </w:p>
           <w:p>
@@ -22548,6 +23447,76 @@
                 <w:sz w:val="17"/>
                 <w:szCs w:val="17"/>
               </w:rPr>
+              <w:t xml:space="preserve">    </w:t>
+            </w:r>
+            <w:proofErr w:type="spellStart"/>
+            <w:proofErr w:type="gramStart"/>
+            <w:r>
+              <w:rPr>
+                <w:rFonts w:ascii="Verdana" w:eastAsia="Verdana" w:hAnsi="Verdana" w:cs="Verdana"/>
+                <w:color w:val="1F2A44"/>
+                <w:sz w:val="17"/>
+                <w:szCs w:val="17"/>
+              </w:rPr>
+              <w:t>wadah.appendChild</w:t>
+            </w:r>
+            <w:proofErr w:type="spellEnd"/>
+            <w:proofErr w:type="gramEnd"/>
+            <w:r>
+              <w:rPr>
+                <w:rFonts w:ascii="Verdana" w:eastAsia="Verdana" w:hAnsi="Verdana" w:cs="Verdana"/>
+                <w:color w:val="1F2A44"/>
+                <w:sz w:val="17"/>
+                <w:szCs w:val="17"/>
+              </w:rPr>
+              <w:t>(</w:t>
+            </w:r>
+            <w:proofErr w:type="spellStart"/>
+            <w:r>
+              <w:rPr>
+                <w:rFonts w:ascii="Verdana" w:eastAsia="Verdana" w:hAnsi="Verdana" w:cs="Verdana"/>
+                <w:color w:val="1F2A44"/>
+                <w:sz w:val="17"/>
+                <w:szCs w:val="17"/>
+              </w:rPr>
+              <w:t>kartu</w:t>
+            </w:r>
+            <w:proofErr w:type="spellEnd"/>
+            <w:r>
+              <w:rPr>
+                <w:rFonts w:ascii="Verdana" w:eastAsia="Verdana" w:hAnsi="Verdana" w:cs="Verdana"/>
+                <w:color w:val="1F2A44"/>
+                <w:sz w:val="17"/>
+                <w:szCs w:val="17"/>
+              </w:rPr>
+              <w:t>);</w:t>
+            </w:r>
+          </w:p>
+          <w:p>
+            <w:pPr>
+              <w:spacing w:after="0"/>
+            </w:pPr>
+            <w:r>
+              <w:rPr>
+                <w:rFonts w:ascii="Verdana" w:eastAsia="Verdana" w:hAnsi="Verdana" w:cs="Verdana"/>
+                <w:color w:val="1F2A44"/>
+                <w:sz w:val="17"/>
+                <w:szCs w:val="17"/>
+              </w:rPr>
+              <w:t xml:space="preserve">  });</w:t>
+            </w:r>
+          </w:p>
+          <w:p>
+            <w:pPr>
+              <w:spacing w:after="0"/>
+            </w:pPr>
+            <w:r>
+              <w:rPr>
+                <w:rFonts w:ascii="Verdana" w:eastAsia="Verdana" w:hAnsi="Verdana" w:cs="Verdana"/>
+                <w:color w:val="1F2A44"/>
+                <w:sz w:val="17"/>
+                <w:szCs w:val="17"/>
+              </w:rPr>
               <w:t>}</w:t>
             </w:r>
           </w:p>
@@ -22574,6 +23543,7 @@
               <w:t xml:space="preserve">async function </w:t>
             </w:r>
             <w:proofErr w:type="spellStart"/>
+            <w:proofErr w:type="gramStart"/>
             <w:r>
               <w:rPr>
                 <w:rFonts w:ascii="Verdana" w:hAnsi="Verdana"/>
@@ -22589,27 +23559,37 @@
                 <w:sz w:val="17"/>
                 <w:szCs w:val="17"/>
               </w:rPr>
-              <w:t>() {</w:t>
-            </w:r>
-          </w:p>
-          <w:p>
-            <w:pPr>
-              <w:spacing w:after="0"/>
+              <w:t>(</w:t>
+            </w:r>
+            <w:proofErr w:type="gramEnd"/>
+            <w:r>
               <w:rPr>
                 <w:rFonts w:ascii="Verdana" w:hAnsi="Verdana"/>
                 <w:sz w:val="17"/>
                 <w:szCs w:val="17"/>
               </w:rPr>
-            </w:pPr>
-            <w:r>
+              <w:t>) {</w:t>
+            </w:r>
+          </w:p>
+          <w:p>
+            <w:pPr>
+              <w:spacing w:after="0"/>
               <w:rPr>
                 <w:rFonts w:ascii="Verdana" w:hAnsi="Verdana"/>
                 <w:sz w:val="17"/>
                 <w:szCs w:val="17"/>
               </w:rPr>
+            </w:pPr>
+            <w:r>
+              <w:rPr>
+                <w:rFonts w:ascii="Verdana" w:hAnsi="Verdana"/>
+                <w:sz w:val="17"/>
+                <w:szCs w:val="17"/>
+              </w:rPr>
               <w:t xml:space="preserve">  </w:t>
             </w:r>
             <w:proofErr w:type="spellStart"/>
+            <w:proofErr w:type="gramStart"/>
             <w:r>
               <w:rPr>
                 <w:rFonts w:ascii="Verdana" w:hAnsi="Verdana"/>
@@ -22619,6 +23599,7 @@
               <w:t>wadah.textContent</w:t>
             </w:r>
             <w:proofErr w:type="spellEnd"/>
+            <w:proofErr w:type="gramEnd"/>
             <w:r>
               <w:rPr>
                 <w:rFonts w:ascii="Verdana" w:hAnsi="Verdana"/>
@@ -22682,6 +23663,7 @@
               <w:t xml:space="preserve">    const daftar = await </w:t>
             </w:r>
             <w:proofErr w:type="spellStart"/>
+            <w:proofErr w:type="gramStart"/>
             <w:r>
               <w:rPr>
                 <w:rFonts w:ascii="Verdana" w:hAnsi="Verdana"/>
@@ -22697,27 +23679,37 @@
                 <w:sz w:val="17"/>
                 <w:szCs w:val="17"/>
               </w:rPr>
-              <w:t>();</w:t>
-            </w:r>
-          </w:p>
-          <w:p>
-            <w:pPr>
-              <w:spacing w:after="0"/>
+              <w:t>(</w:t>
+            </w:r>
+            <w:proofErr w:type="gramEnd"/>
+            <w:r>
               <w:rPr>
                 <w:rFonts w:ascii="Verdana" w:hAnsi="Verdana"/>
                 <w:sz w:val="17"/>
                 <w:szCs w:val="17"/>
               </w:rPr>
-            </w:pPr>
-            <w:r>
+              <w:t>);</w:t>
+            </w:r>
+          </w:p>
+          <w:p>
+            <w:pPr>
+              <w:spacing w:after="0"/>
               <w:rPr>
                 <w:rFonts w:ascii="Verdana" w:hAnsi="Verdana"/>
                 <w:sz w:val="17"/>
                 <w:szCs w:val="17"/>
               </w:rPr>
+            </w:pPr>
+            <w:r>
+              <w:rPr>
+                <w:rFonts w:ascii="Verdana" w:hAnsi="Verdana"/>
+                <w:sz w:val="17"/>
+                <w:szCs w:val="17"/>
+              </w:rPr>
               <w:t xml:space="preserve">    if (</w:t>
             </w:r>
             <w:proofErr w:type="spellStart"/>
+            <w:proofErr w:type="gramStart"/>
             <w:r>
               <w:rPr>
                 <w:rFonts w:ascii="Verdana" w:hAnsi="Verdana"/>
@@ -22727,33 +23719,45 @@
               <w:t>daftar.length</w:t>
             </w:r>
             <w:proofErr w:type="spellEnd"/>
+            <w:proofErr w:type="gramEnd"/>
             <w:r>
               <w:rPr>
                 <w:rFonts w:ascii="Verdana" w:hAnsi="Verdana"/>
                 <w:sz w:val="17"/>
                 <w:szCs w:val="17"/>
               </w:rPr>
-              <w:t xml:space="preserve"> === 0) {</w:t>
-            </w:r>
-          </w:p>
-          <w:p>
-            <w:pPr>
-              <w:spacing w:after="0"/>
+              <w:t xml:space="preserve"> === </w:t>
+            </w:r>
+            <w:proofErr w:type="gramStart"/>
+            <w:r>
               <w:rPr>
                 <w:rFonts w:ascii="Verdana" w:hAnsi="Verdana"/>
                 <w:sz w:val="17"/>
                 <w:szCs w:val="17"/>
               </w:rPr>
-            </w:pPr>
-            <w:r>
+              <w:t>0) {</w:t>
+            </w:r>
+            <w:proofErr w:type="gramEnd"/>
+          </w:p>
+          <w:p>
+            <w:pPr>
+              <w:spacing w:after="0"/>
               <w:rPr>
                 <w:rFonts w:ascii="Verdana" w:hAnsi="Verdana"/>
                 <w:sz w:val="17"/>
                 <w:szCs w:val="17"/>
               </w:rPr>
+            </w:pPr>
+            <w:r>
+              <w:rPr>
+                <w:rFonts w:ascii="Verdana" w:hAnsi="Verdana"/>
+                <w:sz w:val="17"/>
+                <w:szCs w:val="17"/>
+              </w:rPr>
               <w:t xml:space="preserve">      </w:t>
             </w:r>
             <w:proofErr w:type="spellStart"/>
+            <w:proofErr w:type="gramStart"/>
             <w:r>
               <w:rPr>
                 <w:rFonts w:ascii="Verdana" w:hAnsi="Verdana"/>
@@ -22763,6 +23767,7 @@
               <w:t>wadah.textContent</w:t>
             </w:r>
             <w:proofErr w:type="spellEnd"/>
+            <w:proofErr w:type="gramEnd"/>
             <w:r>
               <w:rPr>
                 <w:rFonts w:ascii="Verdana" w:hAnsi="Verdana"/>
@@ -22898,6 +23903,7 @@
               <w:t xml:space="preserve">  } catch (</w:t>
             </w:r>
             <w:proofErr w:type="spellStart"/>
+            <w:proofErr w:type="gramStart"/>
             <w:r>
               <w:rPr>
                 <w:rFonts w:ascii="Verdana" w:hAnsi="Verdana"/>
@@ -22915,6 +23921,7 @@
               </w:rPr>
               <w:t>) {</w:t>
             </w:r>
+            <w:proofErr w:type="gramEnd"/>
           </w:p>
           <w:p>
             <w:pPr>
@@ -22934,6 +23941,7 @@
               <w:t xml:space="preserve">    </w:t>
             </w:r>
             <w:proofErr w:type="spellStart"/>
+            <w:proofErr w:type="gramStart"/>
             <w:r>
               <w:rPr>
                 <w:rFonts w:ascii="Verdana" w:hAnsi="Verdana"/>
@@ -22943,6 +23951,7 @@
               <w:t>wadah.textContent</w:t>
             </w:r>
             <w:proofErr w:type="spellEnd"/>
+            <w:proofErr w:type="gramEnd"/>
             <w:r>
               <w:rPr>
                 <w:rFonts w:ascii="Verdana" w:hAnsi="Verdana"/>
@@ -22988,6 +23997,7 @@
               <w:t xml:space="preserve"> data: ' + </w:t>
             </w:r>
             <w:proofErr w:type="spellStart"/>
+            <w:proofErr w:type="gramStart"/>
             <w:r>
               <w:rPr>
                 <w:rFonts w:ascii="Verdana" w:hAnsi="Verdana"/>
@@ -22997,6 +24007,7 @@
               <w:t>galat.message</w:t>
             </w:r>
             <w:proofErr w:type="spellEnd"/>
+            <w:proofErr w:type="gramEnd"/>
             <w:r>
               <w:rPr>
                 <w:rFonts w:ascii="Verdana" w:hAnsi="Verdana"/>
@@ -23057,6 +24068,7 @@
               <w:spacing w:after="0"/>
             </w:pPr>
             <w:proofErr w:type="spellStart"/>
+            <w:proofErr w:type="gramStart"/>
             <w:r>
               <w:rPr>
                 <w:rFonts w:ascii="Verdana" w:hAnsi="Verdana"/>
@@ -23072,7 +24084,16 @@
                 <w:sz w:val="17"/>
                 <w:szCs w:val="17"/>
               </w:rPr>
-              <w:t>();</w:t>
+              <w:t>(</w:t>
+            </w:r>
+            <w:proofErr w:type="gramEnd"/>
+            <w:r>
+              <w:rPr>
+                <w:rFonts w:ascii="Verdana" w:hAnsi="Verdana"/>
+                <w:sz w:val="17"/>
+                <w:szCs w:val="17"/>
+              </w:rPr>
+              <w:t>);</w:t>
             </w:r>
           </w:p>
         </w:tc>
@@ -23087,6 +24108,7 @@
       <w:pPr>
         <w:spacing w:before="280" w:after="80"/>
       </w:pPr>
+      <w:proofErr w:type="gramStart"/>
       <w:r>
         <w:rPr>
           <w:b/>
@@ -23109,6 +24131,7 @@
         <w:t>Keempat</w:t>
       </w:r>
       <w:proofErr w:type="spellEnd"/>
+      <w:proofErr w:type="gramEnd"/>
       <w:r>
         <w:rPr>
           <w:b/>
@@ -23987,6 +25010,7 @@
       <w:pPr>
         <w:spacing w:before="280" w:after="80"/>
       </w:pPr>
+      <w:proofErr w:type="gramStart"/>
       <w:r>
         <w:rPr>
           <w:b/>
@@ -24009,6 +25033,7 @@
         <w:t>Periksa</w:t>
       </w:r>
       <w:proofErr w:type="spellEnd"/>
+      <w:proofErr w:type="gramEnd"/>
       <w:r>
         <w:rPr>
           <w:b/>
@@ -25160,6 +26185,7 @@
             <w:pPr>
               <w:spacing w:after="0"/>
             </w:pPr>
+            <w:proofErr w:type="gramStart"/>
             <w:r>
               <w:rPr>
                 <w:b/>
@@ -25172,7 +26198,14 @@
               <w:rPr>
                 <w:color w:val="FFFFFF"/>
               </w:rPr>
-              <w:t>SIMPAN KE GIT - SETELAH LEMBAR D</w:t>
+              <w:t>SIMPAN</w:t>
+            </w:r>
+            <w:proofErr w:type="gramEnd"/>
+            <w:r>
+              <w:rPr>
+                <w:color w:val="FFFFFF"/>
+              </w:rPr>
+              <w:t xml:space="preserve"> KE GIT - SETELAH LEMBAR D</w:t>
             </w:r>
           </w:p>
         </w:tc>
@@ -25223,8 +26256,19 @@
                 <w:sz w:val="17"/>
                 <w:szCs w:val="17"/>
               </w:rPr>
-              <w:t>git add .</w:t>
-            </w:r>
+              <w:t xml:space="preserve">git </w:t>
+            </w:r>
+            <w:proofErr w:type="gramStart"/>
+            <w:r>
+              <w:rPr>
+                <w:rFonts w:ascii="Verdana" w:eastAsia="Verdana" w:hAnsi="Verdana" w:cs="Verdana"/>
+                <w:color w:val="1F2A44"/>
+                <w:sz w:val="17"/>
+                <w:szCs w:val="17"/>
+              </w:rPr>
+              <w:t>add .</w:t>
+            </w:r>
+            <w:proofErr w:type="gramEnd"/>
           </w:p>
           <w:p>
             <w:pPr>
@@ -26363,13 +27407,23 @@
             <w:pPr>
               <w:spacing w:after="0"/>
             </w:pPr>
+            <w:proofErr w:type="gramStart"/>
             <w:r>
               <w:rPr>
                 <w:color w:val="FFFFFF"/>
                 <w:sz w:val="17"/>
                 <w:szCs w:val="17"/>
               </w:rPr>
-              <w:t>▌  TIDAK ADA GALAT DI CONSOLE, TETAPI HALAMAN DIAM</w:t>
+              <w:t>▌  TIDAK</w:t>
+            </w:r>
+            <w:proofErr w:type="gramEnd"/>
+            <w:r>
+              <w:rPr>
+                <w:color w:val="FFFFFF"/>
+                <w:sz w:val="17"/>
+                <w:szCs w:val="17"/>
+              </w:rPr>
+              <w:t xml:space="preserve"> ADA GALAT DI CONSOLE, TETAPI HALAMAN DIAM</w:t>
             </w:r>
           </w:p>
           <w:p>
@@ -26767,6 +27821,7 @@
       <w:pPr>
         <w:spacing w:before="280" w:after="80"/>
       </w:pPr>
+      <w:proofErr w:type="gramStart"/>
       <w:r>
         <w:rPr>
           <w:b/>
@@ -26775,9 +27830,9 @@
           <w:sz w:val="22"/>
           <w:szCs w:val="22"/>
         </w:rPr>
-        <w:t xml:space="preserve">E.1  Status 404 </w:t>
-      </w:r>
-      <w:proofErr w:type="spellStart"/>
+        <w:t>E.1  Status</w:t>
+      </w:r>
+      <w:proofErr w:type="gramEnd"/>
       <w:r>
         <w:rPr>
           <w:b/>
@@ -26786,9 +27841,9 @@
           <w:sz w:val="22"/>
           <w:szCs w:val="22"/>
         </w:rPr>
-        <w:t>tidak</w:t>
-      </w:r>
-      <w:proofErr w:type="spellEnd"/>
+        <w:t xml:space="preserve"> 404 </w:t>
+      </w:r>
+      <w:proofErr w:type="spellStart"/>
       <w:r>
         <w:rPr>
           <w:b/>
@@ -26797,9 +27852,9 @@
           <w:sz w:val="22"/>
           <w:szCs w:val="22"/>
         </w:rPr>
-        <w:t xml:space="preserve"> </w:t>
-      </w:r>
-      <w:proofErr w:type="spellStart"/>
+        <w:t>tidak</w:t>
+      </w:r>
+      <w:proofErr w:type="spellEnd"/>
       <w:r>
         <w:rPr>
           <w:b/>
@@ -26808,9 +27863,9 @@
           <w:sz w:val="22"/>
           <w:szCs w:val="22"/>
         </w:rPr>
-        <w:t>melempar</w:t>
-      </w:r>
-      <w:proofErr w:type="spellEnd"/>
+        <w:t xml:space="preserve"> </w:t>
+      </w:r>
+      <w:proofErr w:type="spellStart"/>
       <w:r>
         <w:rPr>
           <w:b/>
@@ -26819,9 +27874,9 @@
           <w:sz w:val="22"/>
           <w:szCs w:val="22"/>
         </w:rPr>
-        <w:t xml:space="preserve"> </w:t>
-      </w:r>
-      <w:proofErr w:type="spellStart"/>
+        <w:t>melempar</w:t>
+      </w:r>
+      <w:proofErr w:type="spellEnd"/>
       <w:r>
         <w:rPr>
           <w:b/>
@@ -26830,6 +27885,17 @@
           <w:sz w:val="22"/>
           <w:szCs w:val="22"/>
         </w:rPr>
+        <w:t xml:space="preserve"> </w:t>
+      </w:r>
+      <w:proofErr w:type="spellStart"/>
+      <w:r>
+        <w:rPr>
+          <w:b/>
+          <w:bCs/>
+          <w:color w:val="003796"/>
+          <w:sz w:val="22"/>
+          <w:szCs w:val="22"/>
+        </w:rPr>
         <w:t>galat</w:t>
       </w:r>
       <w:proofErr w:type="spellEnd"/>
@@ -27097,6 +28163,7 @@
         <w:t xml:space="preserve"> </w:t>
       </w:r>
       <w:proofErr w:type="spellStart"/>
+      <w:proofErr w:type="gramStart"/>
       <w:r>
         <w:rPr>
           <w:color w:val="1A1A2E"/>
@@ -27104,6 +28171,7 @@
         <w:t>respons.ok</w:t>
       </w:r>
       <w:proofErr w:type="spellEnd"/>
+      <w:proofErr w:type="gramEnd"/>
       <w:r>
         <w:rPr>
           <w:color w:val="1A1A2E"/>
@@ -27475,6 +28543,7 @@
               <w:t xml:space="preserve"> </w:t>
             </w:r>
             <w:proofErr w:type="spellStart"/>
+            <w:proofErr w:type="gramStart"/>
             <w:r>
               <w:rPr>
                 <w:color w:val="1A1A2E"/>
@@ -27484,6 +28553,7 @@
               <w:t>respons.ok</w:t>
             </w:r>
             <w:proofErr w:type="spellEnd"/>
+            <w:proofErr w:type="gramEnd"/>
             <w:r>
               <w:rPr>
                 <w:color w:val="1A1A2E"/>
@@ -27529,6 +28599,7 @@
               <w:t xml:space="preserve"> </w:t>
             </w:r>
             <w:proofErr w:type="spellStart"/>
+            <w:proofErr w:type="gramStart"/>
             <w:r>
               <w:rPr>
                 <w:color w:val="1A1A2E"/>
@@ -27544,7 +28615,16 @@
                 <w:sz w:val="18"/>
                 <w:szCs w:val="18"/>
               </w:rPr>
-              <w:t>()</w:t>
+              <w:t>(</w:t>
+            </w:r>
+            <w:proofErr w:type="gramEnd"/>
+            <w:r>
+              <w:rPr>
+                <w:color w:val="1A1A2E"/>
+                <w:sz w:val="18"/>
+                <w:szCs w:val="18"/>
+              </w:rPr>
+              <w:t>)</w:t>
             </w:r>
           </w:p>
         </w:tc>
@@ -27761,6 +28841,7 @@
               <w:spacing w:after="0"/>
             </w:pPr>
             <w:proofErr w:type="spellStart"/>
+            <w:proofErr w:type="gramStart"/>
             <w:r>
               <w:rPr>
                 <w:color w:val="1A1A2E"/>
@@ -27776,7 +28857,16 @@
                 <w:sz w:val="18"/>
                 <w:szCs w:val="18"/>
               </w:rPr>
-              <w:t xml:space="preserve">() </w:t>
+              <w:t>(</w:t>
+            </w:r>
+            <w:proofErr w:type="gramEnd"/>
+            <w:r>
+              <w:rPr>
+                <w:color w:val="1A1A2E"/>
+                <w:sz w:val="18"/>
+                <w:szCs w:val="18"/>
+              </w:rPr>
+              <w:t xml:space="preserve">) </w:t>
             </w:r>
             <w:proofErr w:type="spellStart"/>
             <w:r>
@@ -27937,6 +29027,7 @@
       <w:pPr>
         <w:spacing w:before="280" w:after="80"/>
       </w:pPr>
+      <w:proofErr w:type="gramStart"/>
       <w:r>
         <w:rPr>
           <w:b/>
@@ -27945,7 +29036,18 @@
           <w:sz w:val="22"/>
           <w:szCs w:val="22"/>
         </w:rPr>
-        <w:t xml:space="preserve">E.2  await di </w:t>
+        <w:t>E.2  await</w:t>
+      </w:r>
+      <w:proofErr w:type="gramEnd"/>
+      <w:r>
+        <w:rPr>
+          <w:b/>
+          <w:bCs/>
+          <w:color w:val="003796"/>
+          <w:sz w:val="22"/>
+          <w:szCs w:val="22"/>
+        </w:rPr>
+        <w:t xml:space="preserve"> di </w:t>
       </w:r>
       <w:proofErr w:type="spellStart"/>
       <w:r>
@@ -28458,18 +29560,9 @@
                 <w:sz w:val="17"/>
                 <w:szCs w:val="17"/>
               </w:rPr>
-              <w:t>const data = await fetch(ALAMAT);</w:t>
-            </w:r>
-          </w:p>
-          <w:p>
-            <w:pPr>
-              <w:spacing w:after="0"/>
-            </w:pPr>
-          </w:p>
-          <w:p>
-            <w:pPr>
-              <w:spacing w:after="0"/>
-            </w:pPr>
+              <w:t xml:space="preserve">const data = await </w:t>
+            </w:r>
+            <w:proofErr w:type="gramStart"/>
             <w:r>
               <w:rPr>
                 <w:rFonts w:ascii="Verdana" w:eastAsia="Verdana" w:hAnsi="Verdana" w:cs="Verdana"/>
@@ -28477,9 +29570,9 @@
                 <w:sz w:val="17"/>
                 <w:szCs w:val="17"/>
               </w:rPr>
-              <w:t xml:space="preserve">// </w:t>
-            </w:r>
-            <w:proofErr w:type="spellStart"/>
+              <w:t>fetch(</w:t>
+            </w:r>
+            <w:proofErr w:type="gramEnd"/>
             <w:r>
               <w:rPr>
                 <w:rFonts w:ascii="Verdana" w:eastAsia="Verdana" w:hAnsi="Verdana" w:cs="Verdana"/>
@@ -28487,9 +29580,18 @@
                 <w:sz w:val="17"/>
                 <w:szCs w:val="17"/>
               </w:rPr>
-              <w:t>benar</w:t>
-            </w:r>
-            <w:proofErr w:type="spellEnd"/>
+              <w:t>ALAMAT);</w:t>
+            </w:r>
+          </w:p>
+          <w:p>
+            <w:pPr>
+              <w:spacing w:after="0"/>
+            </w:pPr>
+          </w:p>
+          <w:p>
+            <w:pPr>
+              <w:spacing w:after="0"/>
+            </w:pPr>
             <w:r>
               <w:rPr>
                 <w:rFonts w:ascii="Verdana" w:eastAsia="Verdana" w:hAnsi="Verdana" w:cs="Verdana"/>
@@ -28497,7 +29599,7 @@
                 <w:sz w:val="17"/>
                 <w:szCs w:val="17"/>
               </w:rPr>
-              <w:t xml:space="preserve">: </w:t>
+              <w:t xml:space="preserve">// </w:t>
             </w:r>
             <w:proofErr w:type="spellStart"/>
             <w:r>
@@ -28507,7 +29609,7 @@
                 <w:sz w:val="17"/>
                 <w:szCs w:val="17"/>
               </w:rPr>
-              <w:t>dibungkus</w:t>
+              <w:t>benar</w:t>
             </w:r>
             <w:proofErr w:type="spellEnd"/>
             <w:r>
@@ -28517,7 +29619,7 @@
                 <w:sz w:val="17"/>
                 <w:szCs w:val="17"/>
               </w:rPr>
-              <w:t xml:space="preserve"> </w:t>
+              <w:t xml:space="preserve">: </w:t>
             </w:r>
             <w:proofErr w:type="spellStart"/>
             <w:r>
@@ -28527,7 +29629,7 @@
                 <w:sz w:val="17"/>
                 <w:szCs w:val="17"/>
               </w:rPr>
-              <w:t>fungsi</w:t>
+              <w:t>dibungkus</w:t>
             </w:r>
             <w:proofErr w:type="spellEnd"/>
             <w:r>
@@ -28537,13 +29639,9 @@
                 <w:sz w:val="17"/>
                 <w:szCs w:val="17"/>
               </w:rPr>
-              <w:t xml:space="preserve"> async</w:t>
-            </w:r>
-          </w:p>
-          <w:p>
-            <w:pPr>
-              <w:spacing w:after="0"/>
-            </w:pPr>
+              <w:t xml:space="preserve"> </w:t>
+            </w:r>
+            <w:proofErr w:type="spellStart"/>
             <w:r>
               <w:rPr>
                 <w:rFonts w:ascii="Verdana" w:eastAsia="Verdana" w:hAnsi="Verdana" w:cs="Verdana"/>
@@ -28551,9 +29649,9 @@
                 <w:sz w:val="17"/>
                 <w:szCs w:val="17"/>
               </w:rPr>
-              <w:t xml:space="preserve">async function </w:t>
-            </w:r>
-            <w:proofErr w:type="spellStart"/>
+              <w:t>fungsi</w:t>
+            </w:r>
+            <w:proofErr w:type="spellEnd"/>
             <w:r>
               <w:rPr>
                 <w:rFonts w:ascii="Verdana" w:eastAsia="Verdana" w:hAnsi="Verdana" w:cs="Verdana"/>
@@ -28561,9 +29659,13 @@
                 <w:sz w:val="17"/>
                 <w:szCs w:val="17"/>
               </w:rPr>
-              <w:t>muat</w:t>
-            </w:r>
-            <w:proofErr w:type="spellEnd"/>
+              <w:t xml:space="preserve"> async</w:t>
+            </w:r>
+          </w:p>
+          <w:p>
+            <w:pPr>
+              <w:spacing w:after="0"/>
+            </w:pPr>
             <w:r>
               <w:rPr>
                 <w:rFonts w:ascii="Verdana" w:eastAsia="Verdana" w:hAnsi="Verdana" w:cs="Verdana"/>
@@ -28571,13 +29673,10 @@
                 <w:sz w:val="17"/>
                 <w:szCs w:val="17"/>
               </w:rPr>
-              <w:t>() {</w:t>
-            </w:r>
-          </w:p>
-          <w:p>
-            <w:pPr>
-              <w:spacing w:after="0"/>
-            </w:pPr>
+              <w:t xml:space="preserve">async function </w:t>
+            </w:r>
+            <w:proofErr w:type="spellStart"/>
+            <w:proofErr w:type="gramStart"/>
             <w:r>
               <w:rPr>
                 <w:rFonts w:ascii="Verdana" w:eastAsia="Verdana" w:hAnsi="Verdana" w:cs="Verdana"/>
@@ -28585,7 +29684,61 @@
                 <w:sz w:val="17"/>
                 <w:szCs w:val="17"/>
               </w:rPr>
-              <w:t xml:space="preserve">  const data = await fetch(ALAMAT);</w:t>
+              <w:t>muat</w:t>
+            </w:r>
+            <w:proofErr w:type="spellEnd"/>
+            <w:r>
+              <w:rPr>
+                <w:rFonts w:ascii="Verdana" w:eastAsia="Verdana" w:hAnsi="Verdana" w:cs="Verdana"/>
+                <w:color w:val="1F2A44"/>
+                <w:sz w:val="17"/>
+                <w:szCs w:val="17"/>
+              </w:rPr>
+              <w:t>(</w:t>
+            </w:r>
+            <w:proofErr w:type="gramEnd"/>
+            <w:r>
+              <w:rPr>
+                <w:rFonts w:ascii="Verdana" w:eastAsia="Verdana" w:hAnsi="Verdana" w:cs="Verdana"/>
+                <w:color w:val="1F2A44"/>
+                <w:sz w:val="17"/>
+                <w:szCs w:val="17"/>
+              </w:rPr>
+              <w:t>) {</w:t>
+            </w:r>
+          </w:p>
+          <w:p>
+            <w:pPr>
+              <w:spacing w:after="0"/>
+            </w:pPr>
+            <w:r>
+              <w:rPr>
+                <w:rFonts w:ascii="Verdana" w:eastAsia="Verdana" w:hAnsi="Verdana" w:cs="Verdana"/>
+                <w:color w:val="1F2A44"/>
+                <w:sz w:val="17"/>
+                <w:szCs w:val="17"/>
+              </w:rPr>
+              <w:t xml:space="preserve">  const data = await </w:t>
+            </w:r>
+            <w:proofErr w:type="gramStart"/>
+            <w:r>
+              <w:rPr>
+                <w:rFonts w:ascii="Verdana" w:eastAsia="Verdana" w:hAnsi="Verdana" w:cs="Verdana"/>
+                <w:color w:val="1F2A44"/>
+                <w:sz w:val="17"/>
+                <w:szCs w:val="17"/>
+              </w:rPr>
+              <w:t>fetch(</w:t>
+            </w:r>
+            <w:proofErr w:type="gramEnd"/>
+            <w:r>
+              <w:rPr>
+                <w:rFonts w:ascii="Verdana" w:eastAsia="Verdana" w:hAnsi="Verdana" w:cs="Verdana"/>
+                <w:color w:val="1F2A44"/>
+                <w:sz w:val="17"/>
+                <w:szCs w:val="17"/>
+              </w:rPr>
+              <w:t>ALAMAT);</w:t>
             </w:r>
           </w:p>
           <w:p>
@@ -28614,6 +29767,7 @@
       <w:pPr>
         <w:spacing w:before="280" w:after="80"/>
       </w:pPr>
+      <w:proofErr w:type="gramStart"/>
       <w:r>
         <w:rPr>
           <w:b/>
@@ -28636,6 +29790,7 @@
         <w:t>Balasan</w:t>
       </w:r>
       <w:proofErr w:type="spellEnd"/>
+      <w:proofErr w:type="gramEnd"/>
       <w:r>
         <w:rPr>
           <w:b/>
@@ -29540,6 +30695,7 @@
       <w:pPr>
         <w:spacing w:before="280" w:after="80"/>
       </w:pPr>
+      <w:proofErr w:type="gramStart"/>
       <w:r>
         <w:rPr>
           <w:b/>
@@ -29548,7 +30704,18 @@
           <w:sz w:val="22"/>
           <w:szCs w:val="22"/>
         </w:rPr>
-        <w:t xml:space="preserve">E.4  Catat </w:t>
+        <w:t>E.4  Catat</w:t>
+      </w:r>
+      <w:proofErr w:type="gramEnd"/>
+      <w:r>
+        <w:rPr>
+          <w:b/>
+          <w:bCs/>
+          <w:color w:val="003796"/>
+          <w:sz w:val="22"/>
+          <w:szCs w:val="22"/>
+        </w:rPr>
+        <w:t xml:space="preserve"> </w:t>
       </w:r>
       <w:proofErr w:type="spellStart"/>
       <w:r>
@@ -29928,6 +31095,7 @@
             <w:pPr>
               <w:spacing w:after="0"/>
             </w:pPr>
+            <w:proofErr w:type="gramStart"/>
             <w:r>
               <w:rPr>
                 <w:b/>
@@ -29940,7 +31108,14 @@
               <w:rPr>
                 <w:color w:val="FFFFFF"/>
               </w:rPr>
-              <w:t>SIMPAN KE GIT - SETELAH LEMBAR E</w:t>
+              <w:t>SIMPAN</w:t>
+            </w:r>
+            <w:proofErr w:type="gramEnd"/>
+            <w:r>
+              <w:rPr>
+                <w:color w:val="FFFFFF"/>
+              </w:rPr>
+              <w:t xml:space="preserve"> KE GIT - SETELAH LEMBAR E</w:t>
             </w:r>
           </w:p>
         </w:tc>
@@ -29991,8 +31166,19 @@
                 <w:sz w:val="17"/>
                 <w:szCs w:val="17"/>
               </w:rPr>
-              <w:t>git add .</w:t>
-            </w:r>
+              <w:t xml:space="preserve">git </w:t>
+            </w:r>
+            <w:proofErr w:type="gramStart"/>
+            <w:r>
+              <w:rPr>
+                <w:rFonts w:ascii="Verdana" w:eastAsia="Verdana" w:hAnsi="Verdana" w:cs="Verdana"/>
+                <w:color w:val="1F2A44"/>
+                <w:sz w:val="17"/>
+                <w:szCs w:val="17"/>
+              </w:rPr>
+              <w:t>add .</w:t>
+            </w:r>
+            <w:proofErr w:type="gramEnd"/>
           </w:p>
           <w:p>
             <w:pPr>
@@ -31253,13 +32439,23 @@
             <w:pPr>
               <w:spacing w:after="0"/>
             </w:pPr>
+            <w:proofErr w:type="gramStart"/>
             <w:r>
               <w:rPr>
                 <w:color w:val="FFFFFF"/>
                 <w:sz w:val="17"/>
                 <w:szCs w:val="17"/>
               </w:rPr>
-              <w:t>▌  SETIAP KEADAAN DIBUKTIKAN DENGAN TANGKAPAN LAYAR</w:t>
+              <w:t>▌  SETIAP</w:t>
+            </w:r>
+            <w:proofErr w:type="gramEnd"/>
+            <w:r>
+              <w:rPr>
+                <w:color w:val="FFFFFF"/>
+                <w:sz w:val="17"/>
+                <w:szCs w:val="17"/>
+              </w:rPr>
+              <w:t xml:space="preserve"> KEADAAN DIBUKTIKAN DENGAN TANGKAPAN LAYAR</w:t>
             </w:r>
           </w:p>
           <w:p>
@@ -31639,6 +32835,7 @@
       <w:pPr>
         <w:spacing w:before="280" w:after="80"/>
       </w:pPr>
+      <w:proofErr w:type="gramStart"/>
       <w:r>
         <w:rPr>
           <w:b/>
@@ -31661,6 +32858,7 @@
         <w:t>Periksa</w:t>
       </w:r>
       <w:proofErr w:type="spellEnd"/>
+      <w:proofErr w:type="gramEnd"/>
       <w:r>
         <w:rPr>
           <w:b/>
@@ -31978,6 +33176,7 @@
               <w:spacing w:after="0"/>
             </w:pPr>
             <w:proofErr w:type="spellStart"/>
+            <w:proofErr w:type="gramStart"/>
             <w:r>
               <w:rPr>
                 <w:color w:val="1A1A2E"/>
@@ -31987,6 +33186,7 @@
               <w:t>respons.ok</w:t>
             </w:r>
             <w:proofErr w:type="spellEnd"/>
+            <w:proofErr w:type="gramEnd"/>
             <w:r>
               <w:rPr>
                 <w:color w:val="1A1A2E"/>
@@ -32466,6 +33666,7 @@
               <w:t xml:space="preserve"> </w:t>
             </w:r>
             <w:proofErr w:type="spellStart"/>
+            <w:proofErr w:type="gramStart"/>
             <w:r>
               <w:rPr>
                 <w:color w:val="1A1A2E"/>
@@ -32481,7 +33682,16 @@
                 <w:sz w:val="18"/>
                 <w:szCs w:val="18"/>
               </w:rPr>
-              <w:t xml:space="preserve">([]) </w:t>
+              <w:t>(</w:t>
+            </w:r>
+            <w:proofErr w:type="gramEnd"/>
+            <w:r>
+              <w:rPr>
+                <w:color w:val="1A1A2E"/>
+                <w:sz w:val="18"/>
+                <w:szCs w:val="18"/>
+              </w:rPr>
+              <w:t xml:space="preserve">[]) </w:t>
             </w:r>
             <w:proofErr w:type="spellStart"/>
             <w:r>
@@ -33354,6 +34564,7 @@
       <w:pPr>
         <w:spacing w:before="280" w:after="80"/>
       </w:pPr>
+      <w:proofErr w:type="gramStart"/>
       <w:r>
         <w:rPr>
           <w:b/>
@@ -33362,7 +34573,18 @@
           <w:sz w:val="22"/>
           <w:szCs w:val="22"/>
         </w:rPr>
-        <w:t xml:space="preserve">F.2  Bukti </w:t>
+        <w:t>F.2  Bukti</w:t>
+      </w:r>
+      <w:proofErr w:type="gramEnd"/>
+      <w:r>
+        <w:rPr>
+          <w:b/>
+          <w:bCs/>
+          <w:color w:val="003796"/>
+          <w:sz w:val="22"/>
+          <w:szCs w:val="22"/>
+        </w:rPr>
+        <w:t xml:space="preserve"> </w:t>
       </w:r>
       <w:proofErr w:type="spellStart"/>
       <w:r>
@@ -33725,6 +34947,7 @@
       <w:pPr>
         <w:spacing w:before="280" w:after="80"/>
       </w:pPr>
+      <w:proofErr w:type="gramStart"/>
       <w:r>
         <w:rPr>
           <w:b/>
@@ -33733,7 +34956,18 @@
           <w:sz w:val="22"/>
           <w:szCs w:val="22"/>
         </w:rPr>
-        <w:t xml:space="preserve">F.3  Satu baris </w:t>
+        <w:t>F.3  Satu</w:t>
+      </w:r>
+      <w:proofErr w:type="gramEnd"/>
+      <w:r>
+        <w:rPr>
+          <w:b/>
+          <w:bCs/>
+          <w:color w:val="003796"/>
+          <w:sz w:val="22"/>
+          <w:szCs w:val="22"/>
+        </w:rPr>
+        <w:t xml:space="preserve"> baris </w:t>
       </w:r>
       <w:proofErr w:type="spellStart"/>
       <w:r>
@@ -34073,6 +35307,7 @@
       <w:pPr>
         <w:spacing w:before="280" w:after="80"/>
       </w:pPr>
+      <w:proofErr w:type="gramStart"/>
       <w:r>
         <w:rPr>
           <w:b/>
@@ -34095,6 +35330,7 @@
         <w:t>Penilaian</w:t>
       </w:r>
       <w:proofErr w:type="spellEnd"/>
+      <w:proofErr w:type="gramEnd"/>
       <w:r>
         <w:rPr>
           <w:b/>
@@ -34780,6 +36016,7 @@
       <w:pPr>
         <w:spacing w:before="280" w:after="80"/>
       </w:pPr>
+      <w:proofErr w:type="gramStart"/>
       <w:r>
         <w:rPr>
           <w:b/>
@@ -34802,6 +36039,7 @@
         <w:t>Tiket</w:t>
       </w:r>
       <w:proofErr w:type="spellEnd"/>
+      <w:proofErr w:type="gramEnd"/>
       <w:r>
         <w:rPr>
           <w:b/>
@@ -35181,7 +36419,25 @@
                 <w:sz w:val="18"/>
                 <w:szCs w:val="18"/>
               </w:rPr>
-              <w:t xml:space="preserve">Di mana await </w:t>
+              <w:t xml:space="preserve">Di mana </w:t>
+            </w:r>
+            <w:proofErr w:type="gramStart"/>
+            <w:r>
+              <w:rPr>
+                <w:color w:val="1A1A2E"/>
+                <w:sz w:val="18"/>
+                <w:szCs w:val="18"/>
+              </w:rPr>
+              <w:t>await</w:t>
+            </w:r>
+            <w:proofErr w:type="gramEnd"/>
+            <w:r>
+              <w:rPr>
+                <w:color w:val="1A1A2E"/>
+                <w:sz w:val="18"/>
+                <w:szCs w:val="18"/>
+              </w:rPr>
+              <w:t xml:space="preserve"> </w:t>
             </w:r>
             <w:proofErr w:type="spellStart"/>
             <w:r>
@@ -35386,6 +36642,7 @@
       <w:pPr>
         <w:spacing w:before="280" w:after="80"/>
       </w:pPr>
+      <w:proofErr w:type="gramStart"/>
       <w:r>
         <w:rPr>
           <w:b/>
@@ -35408,6 +36665,7 @@
         <w:t>Catatan</w:t>
       </w:r>
       <w:proofErr w:type="spellEnd"/>
+      <w:proofErr w:type="gramEnd"/>
       <w:r>
         <w:rPr>
           <w:b/>
@@ -35850,6 +37108,7 @@
             <w:pPr>
               <w:spacing w:after="0"/>
             </w:pPr>
+            <w:proofErr w:type="gramStart"/>
             <w:r>
               <w:rPr>
                 <w:b/>
@@ -35862,7 +37121,14 @@
               <w:rPr>
                 <w:color w:val="FFFFFF"/>
               </w:rPr>
-              <w:t>SIMPAN KE GIT - SETELAH LEMBAR F</w:t>
+              <w:t>SIMPAN</w:t>
+            </w:r>
+            <w:proofErr w:type="gramEnd"/>
+            <w:r>
+              <w:rPr>
+                <w:color w:val="FFFFFF"/>
+              </w:rPr>
+              <w:t xml:space="preserve"> KE GIT - SETELAH LEMBAR F</w:t>
             </w:r>
           </w:p>
         </w:tc>
@@ -35913,8 +37179,19 @@
                 <w:sz w:val="17"/>
                 <w:szCs w:val="17"/>
               </w:rPr>
-              <w:t>git add .</w:t>
-            </w:r>
+              <w:t xml:space="preserve">git </w:t>
+            </w:r>
+            <w:proofErr w:type="gramStart"/>
+            <w:r>
+              <w:rPr>
+                <w:rFonts w:ascii="Verdana" w:eastAsia="Verdana" w:hAnsi="Verdana" w:cs="Verdana"/>
+                <w:color w:val="1F2A44"/>
+                <w:sz w:val="17"/>
+                <w:szCs w:val="17"/>
+              </w:rPr>
+              <w:t>add .</w:t>
+            </w:r>
+            <w:proofErr w:type="gramEnd"/>
           </w:p>
           <w:p>
             <w:pPr>
@@ -36989,13 +38266,23 @@
             <w:pPr>
               <w:spacing w:after="0"/>
             </w:pPr>
+            <w:proofErr w:type="gramStart"/>
             <w:r>
               <w:rPr>
                 <w:color w:val="FFFFFF"/>
                 <w:sz w:val="17"/>
                 <w:szCs w:val="17"/>
               </w:rPr>
-              <w:t>▌  RUBRIK PENILAIAN        total 100</w:t>
+              <w:t>▌  RUBRIK</w:t>
+            </w:r>
+            <w:proofErr w:type="gramEnd"/>
+            <w:r>
+              <w:rPr>
+                <w:color w:val="FFFFFF"/>
+                <w:sz w:val="17"/>
+                <w:szCs w:val="17"/>
+              </w:rPr>
+              <w:t xml:space="preserve"> PENILAIAN        total 100</w:t>
             </w:r>
           </w:p>
         </w:tc>
@@ -37294,6 +38581,7 @@
               <w:t xml:space="preserve">; </w:t>
             </w:r>
             <w:proofErr w:type="spellStart"/>
+            <w:proofErr w:type="gramStart"/>
             <w:r>
               <w:rPr>
                 <w:color w:val="1A1A2E"/>
@@ -37303,6 +38591,7 @@
               <w:t>respons.ok</w:t>
             </w:r>
             <w:proofErr w:type="spellEnd"/>
+            <w:proofErr w:type="gramEnd"/>
             <w:r>
               <w:rPr>
                 <w:color w:val="1A1A2E"/>
@@ -37512,6 +38801,7 @@
               <w:t xml:space="preserve"> </w:t>
             </w:r>
             <w:proofErr w:type="spellStart"/>
+            <w:proofErr w:type="gramStart"/>
             <w:r>
               <w:rPr>
                 <w:color w:val="1A1A2E"/>
@@ -37521,6 +38811,7 @@
               <w:t>respons.ok</w:t>
             </w:r>
             <w:proofErr w:type="spellEnd"/>
+            <w:proofErr w:type="gramEnd"/>
             <w:r>
               <w:rPr>
                 <w:color w:val="1A1A2E"/>
@@ -37838,6 +39129,7 @@
               <w:spacing w:after="0"/>
             </w:pPr>
             <w:proofErr w:type="spellStart"/>
+            <w:proofErr w:type="gramStart"/>
             <w:r>
               <w:rPr>
                 <w:color w:val="1A1A2E"/>
@@ -37853,7 +39145,34 @@
                 <w:sz w:val="17"/>
                 <w:szCs w:val="17"/>
               </w:rPr>
-              <w:t xml:space="preserve">() dan stringify </w:t>
+              <w:t>(</w:t>
+            </w:r>
+            <w:proofErr w:type="gramEnd"/>
+            <w:r>
+              <w:rPr>
+                <w:color w:val="1A1A2E"/>
+                <w:sz w:val="17"/>
+                <w:szCs w:val="17"/>
+              </w:rPr>
+              <w:t xml:space="preserve">) dan </w:t>
+            </w:r>
+            <w:proofErr w:type="gramStart"/>
+            <w:r>
+              <w:rPr>
+                <w:color w:val="1A1A2E"/>
+                <w:sz w:val="17"/>
+                <w:szCs w:val="17"/>
+              </w:rPr>
+              <w:t>stringify</w:t>
+            </w:r>
+            <w:proofErr w:type="gramEnd"/>
+            <w:r>
+              <w:rPr>
+                <w:color w:val="1A1A2E"/>
+                <w:sz w:val="17"/>
+                <w:szCs w:val="17"/>
+              </w:rPr>
+              <w:t xml:space="preserve"> </w:t>
             </w:r>
             <w:proofErr w:type="spellStart"/>
             <w:r>
@@ -39645,6 +40964,7 @@
             <w:pPr>
               <w:spacing w:after="0"/>
             </w:pPr>
+            <w:proofErr w:type="gramStart"/>
             <w:r>
               <w:rPr>
                 <w:b/>
@@ -39661,7 +40981,16 @@
                 <w:sz w:val="19"/>
                 <w:szCs w:val="19"/>
               </w:rPr>
-              <w:t xml:space="preserve">Yang </w:t>
+              <w:t>Yang</w:t>
+            </w:r>
+            <w:proofErr w:type="gramEnd"/>
+            <w:r>
+              <w:rPr>
+                <w:color w:val="1A1A2E"/>
+                <w:sz w:val="19"/>
+                <w:szCs w:val="19"/>
+              </w:rPr>
+              <w:t xml:space="preserve"> </w:t>
             </w:r>
             <w:proofErr w:type="spellStart"/>
             <w:r>
@@ -40420,13 +41749,23 @@
             <w:pPr>
               <w:spacing w:after="0"/>
             </w:pPr>
+            <w:proofErr w:type="gramStart"/>
             <w:r>
               <w:rPr>
                 <w:color w:val="FFFFFF"/>
                 <w:sz w:val="17"/>
                 <w:szCs w:val="17"/>
               </w:rPr>
-              <w:t xml:space="preserve">▌  REFERENSI CEPAT ASINKRON        </w:t>
+              <w:t>▌  REFERENSI</w:t>
+            </w:r>
+            <w:proofErr w:type="gramEnd"/>
+            <w:r>
+              <w:rPr>
+                <w:color w:val="FFFFFF"/>
+                <w:sz w:val="17"/>
+                <w:szCs w:val="17"/>
+              </w:rPr>
+              <w:t xml:space="preserve"> CEPAT ASINKRON        </w:t>
             </w:r>
             <w:proofErr w:type="spellStart"/>
             <w:r>
@@ -40731,6 +42070,7 @@
               <w:spacing w:after="0"/>
             </w:pPr>
             <w:proofErr w:type="spellStart"/>
+            <w:proofErr w:type="gramStart"/>
             <w:r>
               <w:rPr>
                 <w:color w:val="1A1A2E"/>
@@ -40740,6 +42080,7 @@
               <w:t>respons.ok</w:t>
             </w:r>
             <w:proofErr w:type="spellEnd"/>
+            <w:proofErr w:type="gramEnd"/>
           </w:p>
         </w:tc>
         <w:tc>
@@ -40885,6 +42226,7 @@
               <w:spacing w:after="0"/>
             </w:pPr>
             <w:proofErr w:type="spellStart"/>
+            <w:proofErr w:type="gramStart"/>
             <w:r>
               <w:rPr>
                 <w:color w:val="1A1A2E"/>
@@ -40894,6 +42236,7 @@
               <w:t>respons.status</w:t>
             </w:r>
             <w:proofErr w:type="spellEnd"/>
+            <w:proofErr w:type="gramEnd"/>
           </w:p>
         </w:tc>
         <w:tc>
@@ -40967,6 +42310,7 @@
               <w:spacing w:after="0"/>
             </w:pPr>
             <w:proofErr w:type="spellStart"/>
+            <w:proofErr w:type="gramStart"/>
             <w:r>
               <w:rPr>
                 <w:color w:val="1A1A2E"/>
@@ -40976,6 +42320,7 @@
               <w:t>respons.json</w:t>
             </w:r>
             <w:proofErr w:type="spellEnd"/>
+            <w:proofErr w:type="gramEnd"/>
             <w:r>
               <w:rPr>
                 <w:color w:val="1A1A2E"/>
@@ -41438,7 +42783,25 @@
                 <w:sz w:val="17"/>
                 <w:szCs w:val="17"/>
               </w:rPr>
-              <w:t>throw new Error()</w:t>
+              <w:t xml:space="preserve">throw new </w:t>
+            </w:r>
+            <w:proofErr w:type="gramStart"/>
+            <w:r>
+              <w:rPr>
+                <w:color w:val="1A1A2E"/>
+                <w:sz w:val="17"/>
+                <w:szCs w:val="17"/>
+              </w:rPr>
+              <w:t>Error(</w:t>
+            </w:r>
+            <w:proofErr w:type="gramEnd"/>
+            <w:r>
+              <w:rPr>
+                <w:color w:val="1A1A2E"/>
+                <w:sz w:val="17"/>
+                <w:szCs w:val="17"/>
+              </w:rPr>
+              <w:t>)</w:t>
             </w:r>
           </w:p>
         </w:tc>
@@ -41585,6 +42948,7 @@
               <w:spacing w:after="0"/>
             </w:pPr>
             <w:proofErr w:type="spellStart"/>
+            <w:proofErr w:type="gramStart"/>
             <w:r>
               <w:rPr>
                 <w:color w:val="1A1A2E"/>
@@ -41600,7 +42964,16 @@
                 <w:sz w:val="17"/>
                 <w:szCs w:val="17"/>
               </w:rPr>
-              <w:t>([...])</w:t>
+              <w:t>(</w:t>
+            </w:r>
+            <w:proofErr w:type="gramEnd"/>
+            <w:r>
+              <w:rPr>
+                <w:color w:val="1A1A2E"/>
+                <w:sz w:val="17"/>
+                <w:szCs w:val="17"/>
+              </w:rPr>
+              <w:t>[...])</w:t>
             </w:r>
           </w:p>
         </w:tc>
@@ -42112,6 +43485,7 @@
             <w:pPr>
               <w:spacing w:after="0"/>
             </w:pPr>
+            <w:proofErr w:type="gramStart"/>
             <w:r>
               <w:rPr>
                 <w:b/>
@@ -42128,7 +43502,16 @@
                 <w:sz w:val="19"/>
                 <w:szCs w:val="19"/>
               </w:rPr>
-              <w:t xml:space="preserve">KALAU MACET        </w:t>
+              <w:t>KALAU</w:t>
+            </w:r>
+            <w:proofErr w:type="gramEnd"/>
+            <w:r>
+              <w:rPr>
+                <w:color w:val="FFFFFF"/>
+                <w:sz w:val="19"/>
+                <w:szCs w:val="19"/>
+              </w:rPr>
+              <w:t xml:space="preserve"> MACET        </w:t>
             </w:r>
             <w:proofErr w:type="spellStart"/>
             <w:r>
@@ -42977,6 +44360,7 @@
               <w:t xml:space="preserve"> </w:t>
             </w:r>
             <w:proofErr w:type="spellStart"/>
+            <w:proofErr w:type="gramStart"/>
             <w:r>
               <w:rPr>
                 <w:color w:val="1A1A2E"/>
@@ -42986,6 +44370,7 @@
               <w:t>respons.ok</w:t>
             </w:r>
             <w:proofErr w:type="spellEnd"/>
+            <w:proofErr w:type="gramEnd"/>
             <w:r>
               <w:rPr>
                 <w:color w:val="1A1A2E"/>
@@ -43051,6 +44436,7 @@
               <w:t xml:space="preserve"> </w:t>
             </w:r>
             <w:proofErr w:type="spellStart"/>
+            <w:proofErr w:type="gramStart"/>
             <w:r>
               <w:rPr>
                 <w:color w:val="1A1A2E"/>
@@ -43060,6 +44446,7 @@
               <w:t>respons.ok</w:t>
             </w:r>
             <w:proofErr w:type="spellEnd"/>
+            <w:proofErr w:type="gramEnd"/>
             <w:r>
               <w:rPr>
                 <w:color w:val="1A1A2E"/>
@@ -43105,6 +44492,7 @@
               <w:t xml:space="preserve"> </w:t>
             </w:r>
             <w:proofErr w:type="spellStart"/>
+            <w:proofErr w:type="gramStart"/>
             <w:r>
               <w:rPr>
                 <w:color w:val="1A1A2E"/>
@@ -43120,7 +44508,16 @@
                 <w:sz w:val="17"/>
                 <w:szCs w:val="17"/>
               </w:rPr>
-              <w:t>()</w:t>
+              <w:t>(</w:t>
+            </w:r>
+            <w:proofErr w:type="gramEnd"/>
+            <w:r>
+              <w:rPr>
+                <w:color w:val="1A1A2E"/>
+                <w:sz w:val="17"/>
+                <w:szCs w:val="17"/>
+              </w:rPr>
+              <w:t>)</w:t>
             </w:r>
           </w:p>
         </w:tc>
@@ -43139,6 +44536,7 @@
               <w:spacing w:after="0"/>
             </w:pPr>
             <w:proofErr w:type="spellStart"/>
+            <w:proofErr w:type="gramStart"/>
             <w:r>
               <w:rPr>
                 <w:color w:val="1A1A2E"/>
@@ -43154,7 +44552,16 @@
                 <w:sz w:val="17"/>
                 <w:szCs w:val="17"/>
               </w:rPr>
-              <w:t xml:space="preserve">() </w:t>
+              <w:t>(</w:t>
+            </w:r>
+            <w:proofErr w:type="gramEnd"/>
+            <w:r>
+              <w:rPr>
+                <w:color w:val="1A1A2E"/>
+                <w:sz w:val="17"/>
+                <w:szCs w:val="17"/>
+              </w:rPr>
+              <w:t xml:space="preserve">) </w:t>
             </w:r>
             <w:proofErr w:type="spellStart"/>
             <w:r>
@@ -44243,6 +45650,7 @@
               <w:t xml:space="preserve"> </w:t>
             </w:r>
             <w:proofErr w:type="spellStart"/>
+            <w:proofErr w:type="gramStart"/>
             <w:r>
               <w:rPr>
                 <w:color w:val="1A1A2E"/>
@@ -44252,13 +45660,32 @@
               <w:t>wadah.textContent</w:t>
             </w:r>
             <w:proofErr w:type="spellEnd"/>
-            <w:r>
-              <w:rPr>
-                <w:color w:val="1A1A2E"/>
-                <w:sz w:val="17"/>
-                <w:szCs w:val="17"/>
-              </w:rPr>
-              <w:t xml:space="preserve"> = '' di baris </w:t>
+            <w:proofErr w:type="gramEnd"/>
+            <w:r>
+              <w:rPr>
+                <w:color w:val="1A1A2E"/>
+                <w:sz w:val="17"/>
+                <w:szCs w:val="17"/>
+              </w:rPr>
+              <w:t xml:space="preserve"> </w:t>
+            </w:r>
+            <w:proofErr w:type="gramStart"/>
+            <w:r>
+              <w:rPr>
+                <w:color w:val="1A1A2E"/>
+                <w:sz w:val="17"/>
+                <w:szCs w:val="17"/>
+              </w:rPr>
+              <w:t>= ''</w:t>
+            </w:r>
+            <w:proofErr w:type="gramEnd"/>
+            <w:r>
+              <w:rPr>
+                <w:color w:val="1A1A2E"/>
+                <w:sz w:val="17"/>
+                <w:szCs w:val="17"/>
+              </w:rPr>
+              <w:t xml:space="preserve"> di baris </w:t>
             </w:r>
             <w:proofErr w:type="spellStart"/>
             <w:r>
@@ -44719,6 +46146,7 @@
               <w:t xml:space="preserve"> </w:t>
             </w:r>
             <w:proofErr w:type="spellStart"/>
+            <w:proofErr w:type="gramStart"/>
             <w:r>
               <w:rPr>
                 <w:color w:val="1A1A2E"/>
@@ -44728,6 +46156,7 @@
               <w:t>notisia.json</w:t>
             </w:r>
             <w:proofErr w:type="spellEnd"/>
+            <w:proofErr w:type="gramEnd"/>
             <w:r>
               <w:rPr>
                 <w:color w:val="1A1A2E"/>
@@ -44961,6 +46390,7 @@
               <w:t xml:space="preserve">: python3 -m </w:t>
             </w:r>
             <w:proofErr w:type="spellStart"/>
+            <w:proofErr w:type="gramStart"/>
             <w:r>
               <w:rPr>
                 <w:color w:val="1A1A2E"/>
@@ -44970,6 +46400,7 @@
               <w:t>http.server</w:t>
             </w:r>
             <w:proofErr w:type="spellEnd"/>
+            <w:proofErr w:type="gramEnd"/>
             <w:r>
               <w:rPr>
                 <w:color w:val="1A1A2E"/>
@@ -45735,6 +47166,7 @@
             <w:pPr>
               <w:spacing w:after="0"/>
             </w:pPr>
+            <w:proofErr w:type="gramStart"/>
             <w:r>
               <w:rPr>
                 <w:b/>
@@ -45751,7 +47183,16 @@
                 <w:sz w:val="19"/>
                 <w:szCs w:val="19"/>
               </w:rPr>
-              <w:t xml:space="preserve">LAMPIRAN: MENYIMPAN PEKERJAAN ANDA KE GIT        </w:t>
+              <w:t>LAMPIRAN</w:t>
+            </w:r>
+            <w:proofErr w:type="gramEnd"/>
+            <w:r>
+              <w:rPr>
+                <w:color w:val="FFFFFF"/>
+                <w:sz w:val="19"/>
+                <w:szCs w:val="19"/>
+              </w:rPr>
+              <w:t xml:space="preserve">: MENYIMPAN PEKERJAAN ANDA KE GIT        </w:t>
             </w:r>
             <w:proofErr w:type="spellStart"/>
             <w:r>
@@ -46563,8 +48004,18 @@
                 <w:sz w:val="17"/>
                 <w:szCs w:val="17"/>
               </w:rPr>
-              <w:t>git add .</w:t>
-            </w:r>
+              <w:t xml:space="preserve">git </w:t>
+            </w:r>
+            <w:proofErr w:type="gramStart"/>
+            <w:r>
+              <w:rPr>
+                <w:color w:val="1A1A2E"/>
+                <w:sz w:val="17"/>
+                <w:szCs w:val="17"/>
+              </w:rPr>
+              <w:t>add .</w:t>
+            </w:r>
+            <w:proofErr w:type="gramEnd"/>
           </w:p>
         </w:tc>
         <w:tc>
@@ -47204,7 +48655,25 @@
                 <w:sz w:val="18"/>
                 <w:szCs w:val="18"/>
               </w:rPr>
-              <w:t xml:space="preserve"> pada git add .  </w:t>
+              <w:t xml:space="preserve"> pada git </w:t>
+            </w:r>
+            <w:proofErr w:type="gramStart"/>
+            <w:r>
+              <w:rPr>
+                <w:color w:val="1A1A2E"/>
+                <w:sz w:val="18"/>
+                <w:szCs w:val="18"/>
+              </w:rPr>
+              <w:t>add .</w:t>
+            </w:r>
+            <w:proofErr w:type="gramEnd"/>
+            <w:r>
+              <w:rPr>
+                <w:color w:val="1A1A2E"/>
+                <w:sz w:val="18"/>
+                <w:szCs w:val="18"/>
+              </w:rPr>
+              <w:t xml:space="preserve">  </w:t>
             </w:r>
             <w:proofErr w:type="spellStart"/>
             <w:r>
@@ -48854,6 +50323,7 @@
             <w:pPr>
               <w:spacing w:after="0"/>
             </w:pPr>
+            <w:proofErr w:type="gramStart"/>
             <w:r>
               <w:rPr>
                 <w:b/>
@@ -48870,7 +50340,16 @@
                 <w:sz w:val="19"/>
                 <w:szCs w:val="19"/>
               </w:rPr>
-              <w:t xml:space="preserve">Yang </w:t>
+              <w:t>Yang</w:t>
+            </w:r>
+            <w:proofErr w:type="gramEnd"/>
+            <w:r>
+              <w:rPr>
+                <w:color w:val="22543D"/>
+                <w:sz w:val="19"/>
+                <w:szCs w:val="19"/>
+              </w:rPr>
+              <w:t xml:space="preserve"> </w:t>
             </w:r>
             <w:proofErr w:type="spellStart"/>
             <w:r>
@@ -49278,12 +50757,12 @@
       </w:pPr>
     </w:p>
     <w:sectPr>
-      <w:headerReference w:type="even" r:id="rId8"/>
-      <w:headerReference w:type="default" r:id="rId9"/>
-      <w:footerReference w:type="even" r:id="rId10"/>
-      <w:footerReference w:type="default" r:id="rId11"/>
-      <w:headerReference w:type="first" r:id="rId12"/>
-      <w:footerReference w:type="first" r:id="rId13"/>
+      <w:headerReference w:type="even" r:id="rId13"/>
+      <w:headerReference w:type="default" r:id="rId14"/>
+      <w:footerReference w:type="even" r:id="rId15"/>
+      <w:footerReference w:type="default" r:id="rId16"/>
+      <w:headerReference w:type="first" r:id="rId17"/>
+      <w:footerReference w:type="first" r:id="rId18"/>
       <w:pgSz w:w="11906" w:h="16838"/>
       <w:pgMar w:top="964" w:right="1077" w:bottom="907" w:left="1077" w:header="720" w:footer="720" w:gutter="0"/>
       <w:pgNumType w:start="1"/>
@@ -51231,4 +52710,16 @@
   <we:bindings/>
   <we:snapshot xmlns:r="http://schemas.openxmlformats.org/officeDocument/2006/relationships"/>
 </we:webextension>
+</file>
+
+<file path=customXml/item1.xml><?xml version="1.0" encoding="utf-8"?>
+<b:Sources xmlns:b="http://schemas.openxmlformats.org/officeDocument/2006/bibliography" xmlns="http://schemas.openxmlformats.org/officeDocument/2006/bibliography" SelectedStyle="\APASixthEditionOfficeOnline.xsl" StyleName="APA" Version="6"/>
+</file>
+
+<file path=customXml/itemProps1.xml><?xml version="1.0" encoding="utf-8"?>
+<ds:datastoreItem xmlns:ds="http://schemas.openxmlformats.org/officeDocument/2006/customXml" ds:itemID="{FAC2DCB9-B10E-4DFC-80CF-E3C9218226CF}">
+  <ds:schemaRefs>
+    <ds:schemaRef ds:uri="http://schemas.openxmlformats.org/officeDocument/2006/bibliography"/>
+  </ds:schemaRefs>
+</ds:datastoreItem>
 </file>
</xml_diff>